<commit_message>
Add SailPoint and overview Word docs; fix bold markup in text helpers
- 03_SailPoint: the session write-up plus a vendor meeting question sheet
  (references, architecture, licensing, feature demo, PoC terms, overlap
  with existing PAM/vault investment) meant to be read off directly in the
  meeting
- 00_overview: cross-session synthesis — the three talks cover three points
  in time (before adoption, at training, at runtime) — plus the combined
  team checklist and a list of what is and isn't verified

Bug fix in docx_helpers: **bold** markup was only parsed inside table cells,
so it rendered literally in bullets, body text and callouts. para, bullet,
numbered and callout now share the same marked-text writer. All three
existing documents were rebuilt and re-rendered to confirm the fix.

Co-Authored-By: Claude Opus 5 <noreply@anthropic.com>
Claude-Session: https://claude.ai/code/session_01FY226Qah9rLtAPPzU72jv4
</commit_message>
<xml_diff>
--- a/share/01_무신사_AI도입판단기준_세션정리.docx
+++ b/share/01_무신사_AI도입판단기준_세션정리.docx
@@ -139,6 +139,7 @@
             <w:r>
               <w:rPr>
                 <w:b/>
+                <w:i w:val="0"/>
                 <w:sz w:val="19"/>
                 <w:rFonts w:ascii="맑은 고딕" w:hAnsi="맑은 고딕" w:eastAsia="맑은 고딕" w:cs="맑은 고딕"/>
               </w:rPr>
@@ -157,6 +158,7 @@
             <w:r>
               <w:rPr>
                 <w:b w:val="0"/>
+                <w:i w:val="0"/>
                 <w:sz w:val="19"/>
                 <w:rFonts w:ascii="맑은 고딕" w:hAnsi="맑은 고딕" w:eastAsia="맑은 고딕" w:cs="맑은 고딕"/>
               </w:rPr>
@@ -178,6 +180,7 @@
             <w:r>
               <w:rPr>
                 <w:b/>
+                <w:i w:val="0"/>
                 <w:sz w:val="19"/>
                 <w:rFonts w:ascii="맑은 고딕" w:hAnsi="맑은 고딕" w:eastAsia="맑은 고딕" w:cs="맑은 고딕"/>
               </w:rPr>
@@ -197,6 +200,7 @@
             <w:r>
               <w:rPr>
                 <w:b w:val="0"/>
+                <w:i w:val="0"/>
                 <w:sz w:val="19"/>
                 <w:rFonts w:ascii="맑은 고딕" w:hAnsi="맑은 고딕" w:eastAsia="맑은 고딕" w:cs="맑은 고딕"/>
               </w:rPr>
@@ -217,6 +221,7 @@
             <w:r>
               <w:rPr>
                 <w:b/>
+                <w:i w:val="0"/>
                 <w:sz w:val="19"/>
                 <w:rFonts w:ascii="맑은 고딕" w:hAnsi="맑은 고딕" w:eastAsia="맑은 고딕" w:cs="맑은 고딕"/>
               </w:rPr>
@@ -235,6 +240,7 @@
             <w:r>
               <w:rPr>
                 <w:b w:val="0"/>
+                <w:i w:val="0"/>
                 <w:sz w:val="19"/>
                 <w:rFonts w:ascii="맑은 고딕" w:hAnsi="맑은 고딕" w:eastAsia="맑은 고딕" w:cs="맑은 고딕"/>
               </w:rPr>
@@ -256,6 +262,7 @@
             <w:r>
               <w:rPr>
                 <w:b/>
+                <w:i w:val="0"/>
                 <w:sz w:val="19"/>
                 <w:rFonts w:ascii="맑은 고딕" w:hAnsi="맑은 고딕" w:eastAsia="맑은 고딕" w:cs="맑은 고딕"/>
               </w:rPr>
@@ -275,6 +282,7 @@
             <w:r>
               <w:rPr>
                 <w:b w:val="0"/>
+                <w:i w:val="0"/>
                 <w:sz w:val="19"/>
                 <w:rFonts w:ascii="맑은 고딕" w:hAnsi="맑은 고딕" w:eastAsia="맑은 고딕" w:cs="맑은 고딕"/>
               </w:rPr>
@@ -295,6 +303,7 @@
             <w:r>
               <w:rPr>
                 <w:b/>
+                <w:i w:val="0"/>
                 <w:sz w:val="19"/>
                 <w:rFonts w:ascii="맑은 고딕" w:hAnsi="맑은 고딕" w:eastAsia="맑은 고딕" w:cs="맑은 고딕"/>
               </w:rPr>
@@ -313,6 +322,7 @@
             <w:r>
               <w:rPr>
                 <w:b w:val="0"/>
+                <w:i w:val="0"/>
                 <w:sz w:val="19"/>
                 <w:rFonts w:ascii="맑은 고딕" w:hAnsi="맑은 고딕" w:eastAsia="맑은 고딕" w:cs="맑은 고딕"/>
               </w:rPr>
@@ -559,6 +569,7 @@
             <w:r>
               <w:rPr>
                 <w:b/>
+                <w:i w:val="0"/>
                 <w:sz w:val="18"/>
                 <w:rFonts w:ascii="맑은 고딕" w:hAnsi="맑은 고딕" w:eastAsia="맑은 고딕" w:cs="맑은 고딕"/>
               </w:rPr>
@@ -577,6 +588,7 @@
             <w:r>
               <w:rPr>
                 <w:b w:val="0"/>
+                <w:i w:val="0"/>
                 <w:sz w:val="18"/>
                 <w:rFonts w:ascii="맑은 고딕" w:hAnsi="맑은 고딕" w:eastAsia="맑은 고딕" w:cs="맑은 고딕"/>
               </w:rPr>
@@ -595,6 +607,7 @@
             <w:r>
               <w:rPr>
                 <w:b w:val="0"/>
+                <w:i w:val="0"/>
                 <w:sz w:val="18"/>
                 <w:rFonts w:ascii="맑은 고딕" w:hAnsi="맑은 고딕" w:eastAsia="맑은 고딕" w:cs="맑은 고딕"/>
               </w:rPr>
@@ -616,6 +629,7 @@
             <w:r>
               <w:rPr>
                 <w:b/>
+                <w:i w:val="0"/>
                 <w:sz w:val="18"/>
                 <w:rFonts w:ascii="맑은 고딕" w:hAnsi="맑은 고딕" w:eastAsia="맑은 고딕" w:cs="맑은 고딕"/>
               </w:rPr>
@@ -635,6 +649,7 @@
             <w:r>
               <w:rPr>
                 <w:b w:val="0"/>
+                <w:i w:val="0"/>
                 <w:sz w:val="18"/>
                 <w:rFonts w:ascii="맑은 고딕" w:hAnsi="맑은 고딕" w:eastAsia="맑은 고딕" w:cs="맑은 고딕"/>
               </w:rPr>
@@ -654,6 +669,7 @@
             <w:r>
               <w:rPr>
                 <w:b w:val="0"/>
+                <w:i w:val="0"/>
                 <w:sz w:val="18"/>
                 <w:rFonts w:ascii="맑은 고딕" w:hAnsi="맑은 고딕" w:eastAsia="맑은 고딕" w:cs="맑은 고딕"/>
               </w:rPr>
@@ -674,6 +690,7 @@
             <w:r>
               <w:rPr>
                 <w:b/>
+                <w:i w:val="0"/>
                 <w:sz w:val="18"/>
                 <w:rFonts w:ascii="맑은 고딕" w:hAnsi="맑은 고딕" w:eastAsia="맑은 고딕" w:cs="맑은 고딕"/>
               </w:rPr>
@@ -692,6 +709,7 @@
             <w:r>
               <w:rPr>
                 <w:b/>
+                <w:i w:val="0"/>
                 <w:sz w:val="18"/>
                 <w:rFonts w:ascii="맑은 고딕" w:hAnsi="맑은 고딕" w:eastAsia="맑은 고딕" w:cs="맑은 고딕"/>
               </w:rPr>
@@ -710,6 +728,7 @@
             <w:r>
               <w:rPr>
                 <w:b/>
+                <w:i w:val="0"/>
                 <w:sz w:val="18"/>
                 <w:rFonts w:ascii="맑은 고딕" w:hAnsi="맑은 고딕" w:eastAsia="맑은 고딕" w:cs="맑은 고딕"/>
               </w:rPr>
@@ -731,6 +750,7 @@
             <w:r>
               <w:rPr>
                 <w:b/>
+                <w:i w:val="0"/>
                 <w:sz w:val="18"/>
                 <w:rFonts w:ascii="맑은 고딕" w:hAnsi="맑은 고딕" w:eastAsia="맑은 고딕" w:cs="맑은 고딕"/>
               </w:rPr>
@@ -750,6 +770,7 @@
             <w:r>
               <w:rPr>
                 <w:b/>
+                <w:i w:val="0"/>
                 <w:sz w:val="18"/>
                 <w:rFonts w:ascii="맑은 고딕" w:hAnsi="맑은 고딕" w:eastAsia="맑은 고딕" w:cs="맑은 고딕"/>
               </w:rPr>
@@ -769,6 +790,7 @@
             <w:r>
               <w:rPr>
                 <w:b/>
+                <w:i w:val="0"/>
                 <w:sz w:val="18"/>
                 <w:rFonts w:ascii="맑은 고딕" w:hAnsi="맑은 고딕" w:eastAsia="맑은 고딕" w:cs="맑은 고딕"/>
               </w:rPr>
@@ -961,6 +983,7 @@
             <w:r>
               <w:rPr>
                 <w:b/>
+                <w:i w:val="0"/>
                 <w:sz w:val="18"/>
                 <w:rFonts w:ascii="맑은 고딕" w:hAnsi="맑은 고딕" w:eastAsia="맑은 고딕" w:cs="맑은 고딕"/>
               </w:rPr>
@@ -979,6 +1002,7 @@
             <w:r>
               <w:rPr>
                 <w:b w:val="0"/>
+                <w:i w:val="0"/>
                 <w:sz w:val="18"/>
                 <w:rFonts w:ascii="맑은 고딕" w:hAnsi="맑은 고딕" w:eastAsia="맑은 고딕" w:cs="맑은 고딕"/>
               </w:rPr>
@@ -997,6 +1021,7 @@
             <w:r>
               <w:rPr>
                 <w:b w:val="0"/>
+                <w:i w:val="0"/>
                 <w:sz w:val="18"/>
                 <w:rFonts w:ascii="맑은 고딕" w:hAnsi="맑은 고딕" w:eastAsia="맑은 고딕" w:cs="맑은 고딕"/>
               </w:rPr>
@@ -1015,6 +1040,7 @@
             <w:r>
               <w:rPr>
                 <w:b w:val="0"/>
+                <w:i w:val="0"/>
                 <w:sz w:val="18"/>
                 <w:rFonts w:ascii="맑은 고딕" w:hAnsi="맑은 고딕" w:eastAsia="맑은 고딕" w:cs="맑은 고딕"/>
               </w:rPr>
@@ -1036,6 +1062,7 @@
             <w:r>
               <w:rPr>
                 <w:b/>
+                <w:i w:val="0"/>
                 <w:sz w:val="18"/>
                 <w:rFonts w:ascii="맑은 고딕" w:hAnsi="맑은 고딕" w:eastAsia="맑은 고딕" w:cs="맑은 고딕"/>
               </w:rPr>
@@ -1055,6 +1082,7 @@
             <w:r>
               <w:rPr>
                 <w:b w:val="0"/>
+                <w:i w:val="0"/>
                 <w:sz w:val="18"/>
                 <w:rFonts w:ascii="맑은 고딕" w:hAnsi="맑은 고딕" w:eastAsia="맑은 고딕" w:cs="맑은 고딕"/>
               </w:rPr>
@@ -1074,6 +1102,7 @@
             <w:r>
               <w:rPr>
                 <w:b w:val="0"/>
+                <w:i w:val="0"/>
                 <w:sz w:val="18"/>
                 <w:rFonts w:ascii="맑은 고딕" w:hAnsi="맑은 고딕" w:eastAsia="맑은 고딕" w:cs="맑은 고딕"/>
               </w:rPr>
@@ -1093,6 +1122,7 @@
             <w:r>
               <w:rPr>
                 <w:b/>
+                <w:i w:val="0"/>
                 <w:sz w:val="18"/>
                 <w:rFonts w:ascii="맑은 고딕" w:hAnsi="맑은 고딕" w:eastAsia="맑은 고딕" w:cs="맑은 고딕"/>
               </w:rPr>
@@ -1199,6 +1229,7 @@
             <w:r>
               <w:rPr>
                 <w:b/>
+                <w:i w:val="0"/>
                 <w:sz w:val="18"/>
                 <w:rFonts w:ascii="맑은 고딕" w:hAnsi="맑은 고딕" w:eastAsia="맑은 고딕" w:cs="맑은 고딕"/>
               </w:rPr>
@@ -1217,6 +1248,7 @@
             <w:r>
               <w:rPr>
                 <w:b w:val="0"/>
+                <w:i w:val="0"/>
                 <w:sz w:val="18"/>
                 <w:rFonts w:ascii="맑은 고딕" w:hAnsi="맑은 고딕" w:eastAsia="맑은 고딕" w:cs="맑은 고딕"/>
               </w:rPr>
@@ -1238,6 +1270,7 @@
             <w:r>
               <w:rPr>
                 <w:b/>
+                <w:i w:val="0"/>
                 <w:sz w:val="18"/>
                 <w:rFonts w:ascii="맑은 고딕" w:hAnsi="맑은 고딕" w:eastAsia="맑은 고딕" w:cs="맑은 고딕"/>
               </w:rPr>
@@ -1257,6 +1290,7 @@
             <w:r>
               <w:rPr>
                 <w:b w:val="0"/>
+                <w:i w:val="0"/>
                 <w:sz w:val="18"/>
                 <w:rFonts w:ascii="맑은 고딕" w:hAnsi="맑은 고딕" w:eastAsia="맑은 고딕" w:cs="맑은 고딕"/>
               </w:rPr>
@@ -1277,6 +1311,7 @@
             <w:r>
               <w:rPr>
                 <w:b/>
+                <w:i w:val="0"/>
                 <w:sz w:val="18"/>
                 <w:rFonts w:ascii="맑은 고딕" w:hAnsi="맑은 고딕" w:eastAsia="맑은 고딕" w:cs="맑은 고딕"/>
               </w:rPr>
@@ -1295,6 +1330,7 @@
             <w:r>
               <w:rPr>
                 <w:b w:val="0"/>
+                <w:i w:val="0"/>
                 <w:sz w:val="18"/>
                 <w:rFonts w:ascii="맑은 고딕" w:hAnsi="맑은 고딕" w:eastAsia="맑은 고딕" w:cs="맑은 고딕"/>
               </w:rPr>
@@ -1391,6 +1427,8 @@
       </w:pPr>
       <w:r>
         <w:rPr>
+          <w:b w:val="0"/>
+          <w:i w:val="0"/>
           <w:sz w:val="20"/>
           <w:rFonts w:ascii="맑은 고딕" w:hAnsi="맑은 고딕" w:eastAsia="맑은 고딕" w:cs="맑은 고딕"/>
         </w:rPr>
@@ -1405,6 +1443,8 @@
       </w:pPr>
       <w:r>
         <w:rPr>
+          <w:b w:val="0"/>
+          <w:i w:val="0"/>
           <w:sz w:val="20"/>
           <w:rFonts w:ascii="맑은 고딕" w:hAnsi="맑은 고딕" w:eastAsia="맑은 고딕" w:cs="맑은 고딕"/>
         </w:rPr>
@@ -1419,6 +1459,8 @@
       </w:pPr>
       <w:r>
         <w:rPr>
+          <w:b w:val="0"/>
+          <w:i w:val="0"/>
           <w:sz w:val="20"/>
           <w:rFonts w:ascii="맑은 고딕" w:hAnsi="맑은 고딕" w:eastAsia="맑은 고딕" w:cs="맑은 고딕"/>
         </w:rPr>
@@ -1433,6 +1475,8 @@
       </w:pPr>
       <w:r>
         <w:rPr>
+          <w:b w:val="0"/>
+          <w:i w:val="0"/>
           <w:sz w:val="20"/>
           <w:rFonts w:ascii="맑은 고딕" w:hAnsi="맑은 고딕" w:eastAsia="맑은 고딕" w:cs="맑은 고딕"/>
         </w:rPr>
@@ -1447,6 +1491,8 @@
       </w:pPr>
       <w:r>
         <w:rPr>
+          <w:b w:val="0"/>
+          <w:i w:val="0"/>
           <w:sz w:val="20"/>
           <w:rFonts w:ascii="맑은 고딕" w:hAnsi="맑은 고딕" w:eastAsia="맑은 고딕" w:cs="맑은 고딕"/>
         </w:rPr>
@@ -1505,6 +1551,8 @@
       </w:pPr>
       <w:r>
         <w:rPr>
+          <w:b w:val="0"/>
+          <w:i w:val="0"/>
           <w:sz w:val="20"/>
           <w:rFonts w:ascii="맑은 고딕" w:hAnsi="맑은 고딕" w:eastAsia="맑은 고딕" w:cs="맑은 고딕"/>
         </w:rPr>
@@ -1519,6 +1567,8 @@
       </w:pPr>
       <w:r>
         <w:rPr>
+          <w:b w:val="0"/>
+          <w:i w:val="0"/>
           <w:sz w:val="20"/>
           <w:rFonts w:ascii="맑은 고딕" w:hAnsi="맑은 고딕" w:eastAsia="맑은 고딕" w:cs="맑은 고딕"/>
         </w:rPr>
@@ -1616,6 +1666,7 @@
             <w:r>
               <w:rPr>
                 <w:b/>
+                <w:i w:val="0"/>
                 <w:sz w:val="18"/>
                 <w:rFonts w:ascii="맑은 고딕" w:hAnsi="맑은 고딕" w:eastAsia="맑은 고딕" w:cs="맑은 고딕"/>
               </w:rPr>
@@ -1634,6 +1685,7 @@
             <w:r>
               <w:rPr>
                 <w:b w:val="0"/>
+                <w:i w:val="0"/>
                 <w:sz w:val="18"/>
                 <w:rFonts w:ascii="맑은 고딕" w:hAnsi="맑은 고딕" w:eastAsia="맑은 고딕" w:cs="맑은 고딕"/>
               </w:rPr>
@@ -1655,6 +1707,7 @@
             <w:r>
               <w:rPr>
                 <w:b/>
+                <w:i w:val="0"/>
                 <w:sz w:val="18"/>
                 <w:rFonts w:ascii="맑은 고딕" w:hAnsi="맑은 고딕" w:eastAsia="맑은 고딕" w:cs="맑은 고딕"/>
               </w:rPr>
@@ -1674,6 +1727,7 @@
             <w:r>
               <w:rPr>
                 <w:b w:val="0"/>
+                <w:i w:val="0"/>
                 <w:sz w:val="18"/>
                 <w:rFonts w:ascii="맑은 고딕" w:hAnsi="맑은 고딕" w:eastAsia="맑은 고딕" w:cs="맑은 고딕"/>
               </w:rPr>
@@ -1694,6 +1748,7 @@
             <w:r>
               <w:rPr>
                 <w:b/>
+                <w:i w:val="0"/>
                 <w:sz w:val="18"/>
                 <w:rFonts w:ascii="맑은 고딕" w:hAnsi="맑은 고딕" w:eastAsia="맑은 고딕" w:cs="맑은 고딕"/>
               </w:rPr>
@@ -1712,6 +1767,7 @@
             <w:r>
               <w:rPr>
                 <w:b w:val="0"/>
+                <w:i w:val="0"/>
                 <w:sz w:val="18"/>
                 <w:rFonts w:ascii="맑은 고딕" w:hAnsi="맑은 고딕" w:eastAsia="맑은 고딕" w:cs="맑은 고딕"/>
               </w:rPr>
@@ -1733,6 +1789,7 @@
             <w:r>
               <w:rPr>
                 <w:b/>
+                <w:i w:val="0"/>
                 <w:sz w:val="18"/>
                 <w:rFonts w:ascii="맑은 고딕" w:hAnsi="맑은 고딕" w:eastAsia="맑은 고딕" w:cs="맑은 고딕"/>
               </w:rPr>
@@ -1752,6 +1809,7 @@
             <w:r>
               <w:rPr>
                 <w:b w:val="0"/>
+                <w:i w:val="0"/>
                 <w:sz w:val="18"/>
                 <w:rFonts w:ascii="맑은 고딕" w:hAnsi="맑은 고딕" w:eastAsia="맑은 고딕" w:cs="맑은 고딕"/>
               </w:rPr>
@@ -1772,6 +1830,7 @@
             <w:r>
               <w:rPr>
                 <w:b/>
+                <w:i w:val="0"/>
                 <w:sz w:val="18"/>
                 <w:rFonts w:ascii="맑은 고딕" w:hAnsi="맑은 고딕" w:eastAsia="맑은 고딕" w:cs="맑은 고딕"/>
               </w:rPr>
@@ -1790,6 +1849,7 @@
             <w:r>
               <w:rPr>
                 <w:b/>
+                <w:i w:val="0"/>
                 <w:sz w:val="18"/>
                 <w:rFonts w:ascii="맑은 고딕" w:hAnsi="맑은 고딕" w:eastAsia="맑은 고딕" w:cs="맑은 고딕"/>
               </w:rPr>
@@ -2156,6 +2216,7 @@
             <w:r>
               <w:rPr>
                 <w:b/>
+                <w:i w:val="0"/>
                 <w:sz w:val="18"/>
                 <w:rFonts w:ascii="맑은 고딕" w:hAnsi="맑은 고딕" w:eastAsia="맑은 고딕" w:cs="맑은 고딕"/>
               </w:rPr>
@@ -2174,6 +2235,7 @@
             <w:r>
               <w:rPr>
                 <w:b w:val="0"/>
+                <w:i w:val="0"/>
                 <w:sz w:val="18"/>
                 <w:rFonts w:ascii="맑은 고딕" w:hAnsi="맑은 고딕" w:eastAsia="맑은 고딕" w:cs="맑은 고딕"/>
               </w:rPr>
@@ -2192,6 +2254,7 @@
             <w:r>
               <w:rPr>
                 <w:b w:val="0"/>
+                <w:i w:val="0"/>
                 <w:sz w:val="18"/>
                 <w:rFonts w:ascii="맑은 고딕" w:hAnsi="맑은 고딕" w:eastAsia="맑은 고딕" w:cs="맑은 고딕"/>
               </w:rPr>
@@ -2210,6 +2273,7 @@
             <w:r>
               <w:rPr>
                 <w:b w:val="0"/>
+                <w:i w:val="0"/>
                 <w:sz w:val="18"/>
                 <w:rFonts w:ascii="맑은 고딕" w:hAnsi="맑은 고딕" w:eastAsia="맑은 고딕" w:cs="맑은 고딕"/>
               </w:rPr>
@@ -2231,6 +2295,7 @@
             <w:r>
               <w:rPr>
                 <w:b/>
+                <w:i w:val="0"/>
                 <w:sz w:val="18"/>
                 <w:rFonts w:ascii="맑은 고딕" w:hAnsi="맑은 고딕" w:eastAsia="맑은 고딕" w:cs="맑은 고딕"/>
               </w:rPr>
@@ -2250,6 +2315,7 @@
             <w:r>
               <w:rPr>
                 <w:b w:val="0"/>
+                <w:i w:val="0"/>
                 <w:sz w:val="18"/>
                 <w:rFonts w:ascii="맑은 고딕" w:hAnsi="맑은 고딕" w:eastAsia="맑은 고딕" w:cs="맑은 고딕"/>
               </w:rPr>
@@ -2269,6 +2335,7 @@
             <w:r>
               <w:rPr>
                 <w:b w:val="0"/>
+                <w:i w:val="0"/>
                 <w:sz w:val="18"/>
                 <w:rFonts w:ascii="맑은 고딕" w:hAnsi="맑은 고딕" w:eastAsia="맑은 고딕" w:cs="맑은 고딕"/>
               </w:rPr>
@@ -2288,6 +2355,7 @@
             <w:r>
               <w:rPr>
                 <w:b w:val="0"/>
+                <w:i w:val="0"/>
                 <w:sz w:val="18"/>
                 <w:rFonts w:ascii="맑은 고딕" w:hAnsi="맑은 고딕" w:eastAsia="맑은 고딕" w:cs="맑은 고딕"/>
               </w:rPr>
@@ -2308,6 +2376,7 @@
             <w:r>
               <w:rPr>
                 <w:b/>
+                <w:i w:val="0"/>
                 <w:sz w:val="18"/>
                 <w:rFonts w:ascii="맑은 고딕" w:hAnsi="맑은 고딕" w:eastAsia="맑은 고딕" w:cs="맑은 고딕"/>
               </w:rPr>
@@ -2326,6 +2395,7 @@
             <w:r>
               <w:rPr>
                 <w:b w:val="0"/>
+                <w:i w:val="0"/>
                 <w:sz w:val="18"/>
                 <w:rFonts w:ascii="맑은 고딕" w:hAnsi="맑은 고딕" w:eastAsia="맑은 고딕" w:cs="맑은 고딕"/>
               </w:rPr>
@@ -2344,6 +2414,7 @@
             <w:r>
               <w:rPr>
                 <w:b w:val="0"/>
+                <w:i w:val="0"/>
                 <w:sz w:val="18"/>
                 <w:rFonts w:ascii="맑은 고딕" w:hAnsi="맑은 고딕" w:eastAsia="맑은 고딕" w:cs="맑은 고딕"/>
               </w:rPr>
@@ -2362,6 +2433,7 @@
             <w:r>
               <w:rPr>
                 <w:b w:val="0"/>
+                <w:i w:val="0"/>
                 <w:sz w:val="18"/>
                 <w:rFonts w:ascii="맑은 고딕" w:hAnsi="맑은 고딕" w:eastAsia="맑은 고딕" w:cs="맑은 고딕"/>
               </w:rPr>
@@ -2383,6 +2455,7 @@
             <w:r>
               <w:rPr>
                 <w:b/>
+                <w:i w:val="0"/>
                 <w:sz w:val="18"/>
                 <w:rFonts w:ascii="맑은 고딕" w:hAnsi="맑은 고딕" w:eastAsia="맑은 고딕" w:cs="맑은 고딕"/>
               </w:rPr>
@@ -2402,6 +2475,7 @@
             <w:r>
               <w:rPr>
                 <w:b w:val="0"/>
+                <w:i w:val="0"/>
                 <w:sz w:val="18"/>
                 <w:rFonts w:ascii="맑은 고딕" w:hAnsi="맑은 고딕" w:eastAsia="맑은 고딕" w:cs="맑은 고딕"/>
               </w:rPr>
@@ -2421,6 +2495,7 @@
             <w:r>
               <w:rPr>
                 <w:b w:val="0"/>
+                <w:i w:val="0"/>
                 <w:sz w:val="18"/>
                 <w:rFonts w:ascii="맑은 고딕" w:hAnsi="맑은 고딕" w:eastAsia="맑은 고딕" w:cs="맑은 고딕"/>
               </w:rPr>
@@ -2440,6 +2515,7 @@
             <w:r>
               <w:rPr>
                 <w:b w:val="0"/>
+                <w:i w:val="0"/>
                 <w:sz w:val="18"/>
                 <w:rFonts w:ascii="맑은 고딕" w:hAnsi="맑은 고딕" w:eastAsia="맑은 고딕" w:cs="맑은 고딕"/>
               </w:rPr>
@@ -2603,6 +2679,7 @@
             <w:r>
               <w:rPr>
                 <w:b/>
+                <w:i w:val="0"/>
                 <w:sz w:val="18"/>
                 <w:rFonts w:ascii="맑은 고딕" w:hAnsi="맑은 고딕" w:eastAsia="맑은 고딕" w:cs="맑은 고딕"/>
               </w:rPr>
@@ -2621,6 +2698,7 @@
             <w:r>
               <w:rPr>
                 <w:b w:val="0"/>
+                <w:i w:val="0"/>
                 <w:sz w:val="18"/>
                 <w:rFonts w:ascii="맑은 고딕" w:hAnsi="맑은 고딕" w:eastAsia="맑은 고딕" w:cs="맑은 고딕"/>
               </w:rPr>
@@ -2642,6 +2720,7 @@
             <w:r>
               <w:rPr>
                 <w:b/>
+                <w:i w:val="0"/>
                 <w:sz w:val="18"/>
                 <w:rFonts w:ascii="맑은 고딕" w:hAnsi="맑은 고딕" w:eastAsia="맑은 고딕" w:cs="맑은 고딕"/>
               </w:rPr>
@@ -2661,6 +2740,7 @@
             <w:r>
               <w:rPr>
                 <w:b w:val="0"/>
+                <w:i w:val="0"/>
                 <w:sz w:val="18"/>
                 <w:rFonts w:ascii="맑은 고딕" w:hAnsi="맑은 고딕" w:eastAsia="맑은 고딕" w:cs="맑은 고딕"/>
               </w:rPr>
@@ -2681,6 +2761,7 @@
             <w:r>
               <w:rPr>
                 <w:b/>
+                <w:i w:val="0"/>
                 <w:sz w:val="18"/>
                 <w:rFonts w:ascii="맑은 고딕" w:hAnsi="맑은 고딕" w:eastAsia="맑은 고딕" w:cs="맑은 고딕"/>
               </w:rPr>
@@ -2699,6 +2780,7 @@
             <w:r>
               <w:rPr>
                 <w:b w:val="0"/>
+                <w:i w:val="0"/>
                 <w:sz w:val="18"/>
                 <w:rFonts w:ascii="맑은 고딕" w:hAnsi="맑은 고딕" w:eastAsia="맑은 고딕" w:cs="맑은 고딕"/>
               </w:rPr>
@@ -2808,6 +2890,8 @@
       </w:r>
       <w:r>
         <w:rPr>
+          <w:b w:val="0"/>
+          <w:i w:val="0"/>
           <w:sz w:val="20"/>
           <w:rFonts w:ascii="맑은 고딕" w:hAnsi="맑은 고딕" w:eastAsia="맑은 고딕" w:cs="맑은 고딕"/>
         </w:rPr>
@@ -2829,6 +2913,8 @@
       </w:r>
       <w:r>
         <w:rPr>
+          <w:b w:val="0"/>
+          <w:i w:val="0"/>
           <w:sz w:val="20"/>
           <w:rFonts w:ascii="맑은 고딕" w:hAnsi="맑은 고딕" w:eastAsia="맑은 고딕" w:cs="맑은 고딕"/>
         </w:rPr>
@@ -2919,6 +3005,7 @@
             <w:r>
               <w:rPr>
                 <w:b/>
+                <w:i w:val="0"/>
                 <w:sz w:val="18"/>
                 <w:rFonts w:ascii="맑은 고딕" w:hAnsi="맑은 고딕" w:eastAsia="맑은 고딕" w:cs="맑은 고딕"/>
               </w:rPr>
@@ -2937,6 +3024,7 @@
             <w:r>
               <w:rPr>
                 <w:b w:val="0"/>
+                <w:i w:val="0"/>
                 <w:sz w:val="18"/>
                 <w:rFonts w:ascii="맑은 고딕" w:hAnsi="맑은 고딕" w:eastAsia="맑은 고딕" w:cs="맑은 고딕"/>
               </w:rPr>
@@ -2945,6 +3033,7 @@
             <w:r>
               <w:rPr>
                 <w:b/>
+                <w:i w:val="0"/>
                 <w:sz w:val="18"/>
                 <w:rFonts w:ascii="맑은 고딕" w:hAnsi="맑은 고딕" w:eastAsia="맑은 고딕" w:cs="맑은 고딕"/>
               </w:rPr>
@@ -2966,6 +3055,7 @@
             <w:r>
               <w:rPr>
                 <w:b/>
+                <w:i w:val="0"/>
                 <w:sz w:val="18"/>
                 <w:rFonts w:ascii="맑은 고딕" w:hAnsi="맑은 고딕" w:eastAsia="맑은 고딕" w:cs="맑은 고딕"/>
               </w:rPr>
@@ -2985,6 +3075,7 @@
             <w:r>
               <w:rPr>
                 <w:b w:val="0"/>
+                <w:i w:val="0"/>
                 <w:sz w:val="18"/>
                 <w:rFonts w:ascii="맑은 고딕" w:hAnsi="맑은 고딕" w:eastAsia="맑은 고딕" w:cs="맑은 고딕"/>
               </w:rPr>
@@ -2993,6 +3084,7 @@
             <w:r>
               <w:rPr>
                 <w:b/>
+                <w:i w:val="0"/>
                 <w:sz w:val="18"/>
                 <w:rFonts w:ascii="맑은 고딕" w:hAnsi="맑은 고딕" w:eastAsia="맑은 고딕" w:cs="맑은 고딕"/>
               </w:rPr>
@@ -3001,6 +3093,7 @@
             <w:r>
               <w:rPr>
                 <w:b w:val="0"/>
+                <w:i w:val="0"/>
                 <w:sz w:val="18"/>
                 <w:rFonts w:ascii="맑은 고딕" w:hAnsi="맑은 고딕" w:eastAsia="맑은 고딕" w:cs="맑은 고딕"/>
               </w:rPr>
@@ -3021,6 +3114,7 @@
             <w:r>
               <w:rPr>
                 <w:b/>
+                <w:i w:val="0"/>
                 <w:sz w:val="18"/>
                 <w:rFonts w:ascii="맑은 고딕" w:hAnsi="맑은 고딕" w:eastAsia="맑은 고딕" w:cs="맑은 고딕"/>
               </w:rPr>
@@ -3039,6 +3133,7 @@
             <w:r>
               <w:rPr>
                 <w:b/>
+                <w:i w:val="0"/>
                 <w:sz w:val="18"/>
                 <w:rFonts w:ascii="맑은 고딕" w:hAnsi="맑은 고딕" w:eastAsia="맑은 고딕" w:cs="맑은 고딕"/>
               </w:rPr>
@@ -3060,6 +3155,7 @@
             <w:r>
               <w:rPr>
                 <w:b/>
+                <w:i w:val="0"/>
                 <w:sz w:val="18"/>
                 <w:rFonts w:ascii="맑은 고딕" w:hAnsi="맑은 고딕" w:eastAsia="맑은 고딕" w:cs="맑은 고딕"/>
               </w:rPr>
@@ -3079,6 +3175,7 @@
             <w:r>
               <w:rPr>
                 <w:b w:val="0"/>
+                <w:i w:val="0"/>
                 <w:sz w:val="18"/>
                 <w:rFonts w:ascii="맑은 고딕" w:hAnsi="맑은 고딕" w:eastAsia="맑은 고딕" w:cs="맑은 고딕"/>
               </w:rPr>
@@ -3087,6 +3184,7 @@
             <w:r>
               <w:rPr>
                 <w:b/>
+                <w:i w:val="0"/>
                 <w:sz w:val="18"/>
                 <w:rFonts w:ascii="맑은 고딕" w:hAnsi="맑은 고딕" w:eastAsia="맑은 고딕" w:cs="맑은 고딕"/>
               </w:rPr>
@@ -3095,6 +3193,7 @@
             <w:r>
               <w:rPr>
                 <w:b w:val="0"/>
+                <w:i w:val="0"/>
                 <w:sz w:val="18"/>
                 <w:rFonts w:ascii="맑은 고딕" w:hAnsi="맑은 고딕" w:eastAsia="맑은 고딕" w:cs="맑은 고딕"/>
               </w:rPr>
@@ -3115,6 +3214,7 @@
             <w:r>
               <w:rPr>
                 <w:b/>
+                <w:i w:val="0"/>
                 <w:sz w:val="18"/>
                 <w:rFonts w:ascii="맑은 고딕" w:hAnsi="맑은 고딕" w:eastAsia="맑은 고딕" w:cs="맑은 고딕"/>
               </w:rPr>
@@ -3133,6 +3233,7 @@
             <w:r>
               <w:rPr>
                 <w:b w:val="0"/>
+                <w:i w:val="0"/>
                 <w:sz w:val="18"/>
                 <w:rFonts w:ascii="맑은 고딕" w:hAnsi="맑은 고딕" w:eastAsia="맑은 고딕" w:cs="맑은 고딕"/>
               </w:rPr>
@@ -3141,6 +3242,7 @@
             <w:r>
               <w:rPr>
                 <w:b/>
+                <w:i w:val="0"/>
                 <w:sz w:val="18"/>
                 <w:rFonts w:ascii="맑은 고딕" w:hAnsi="맑은 고딕" w:eastAsia="맑은 고딕" w:cs="맑은 고딕"/>
               </w:rPr>
@@ -3149,6 +3251,7 @@
             <w:r>
               <w:rPr>
                 <w:b w:val="0"/>
+                <w:i w:val="0"/>
                 <w:sz w:val="18"/>
                 <w:rFonts w:ascii="맑은 고딕" w:hAnsi="맑은 고딕" w:eastAsia="맑은 고딕" w:cs="맑은 고딕"/>
               </w:rPr>
@@ -3269,6 +3372,7 @@
             <w:r>
               <w:rPr>
                 <w:b/>
+                <w:i w:val="0"/>
                 <w:sz w:val="18"/>
                 <w:rFonts w:ascii="맑은 고딕" w:hAnsi="맑은 고딕" w:eastAsia="맑은 고딕" w:cs="맑은 고딕"/>
               </w:rPr>
@@ -3287,6 +3391,7 @@
             <w:r>
               <w:rPr>
                 <w:b w:val="0"/>
+                <w:i w:val="0"/>
                 <w:sz w:val="18"/>
                 <w:rFonts w:ascii="맑은 고딕" w:hAnsi="맑은 고딕" w:eastAsia="맑은 고딕" w:cs="맑은 고딕"/>
               </w:rPr>
@@ -3308,6 +3413,7 @@
             <w:r>
               <w:rPr>
                 <w:b/>
+                <w:i w:val="0"/>
                 <w:sz w:val="18"/>
                 <w:rFonts w:ascii="맑은 고딕" w:hAnsi="맑은 고딕" w:eastAsia="맑은 고딕" w:cs="맑은 고딕"/>
               </w:rPr>
@@ -3327,6 +3433,7 @@
             <w:r>
               <w:rPr>
                 <w:b w:val="0"/>
+                <w:i w:val="0"/>
                 <w:sz w:val="18"/>
                 <w:rFonts w:ascii="맑은 고딕" w:hAnsi="맑은 고딕" w:eastAsia="맑은 고딕" w:cs="맑은 고딕"/>
               </w:rPr>
@@ -3347,6 +3454,7 @@
             <w:r>
               <w:rPr>
                 <w:b/>
+                <w:i w:val="0"/>
                 <w:sz w:val="18"/>
                 <w:rFonts w:ascii="맑은 고딕" w:hAnsi="맑은 고딕" w:eastAsia="맑은 고딕" w:cs="맑은 고딕"/>
               </w:rPr>
@@ -3365,6 +3473,7 @@
             <w:r>
               <w:rPr>
                 <w:b w:val="0"/>
+                <w:i w:val="0"/>
                 <w:sz w:val="18"/>
                 <w:rFonts w:ascii="맑은 고딕" w:hAnsi="맑은 고딕" w:eastAsia="맑은 고딕" w:cs="맑은 고딕"/>
               </w:rPr>
@@ -3456,6 +3565,7 @@
             <w:r>
               <w:rPr>
                 <w:b/>
+                <w:i w:val="0"/>
                 <w:sz w:val="18"/>
                 <w:rFonts w:ascii="맑은 고딕" w:hAnsi="맑은 고딕" w:eastAsia="맑은 고딕" w:cs="맑은 고딕"/>
               </w:rPr>
@@ -3474,6 +3584,7 @@
             <w:r>
               <w:rPr>
                 <w:b w:val="0"/>
+                <w:i w:val="0"/>
                 <w:sz w:val="18"/>
                 <w:rFonts w:ascii="맑은 고딕" w:hAnsi="맑은 고딕" w:eastAsia="맑은 고딕" w:cs="맑은 고딕"/>
               </w:rPr>
@@ -3495,6 +3606,7 @@
             <w:r>
               <w:rPr>
                 <w:b/>
+                <w:i w:val="0"/>
                 <w:sz w:val="18"/>
                 <w:rFonts w:ascii="맑은 고딕" w:hAnsi="맑은 고딕" w:eastAsia="맑은 고딕" w:cs="맑은 고딕"/>
               </w:rPr>
@@ -3514,6 +3626,7 @@
             <w:r>
               <w:rPr>
                 <w:b w:val="0"/>
+                <w:i w:val="0"/>
                 <w:sz w:val="18"/>
                 <w:rFonts w:ascii="맑은 고딕" w:hAnsi="맑은 고딕" w:eastAsia="맑은 고딕" w:cs="맑은 고딕"/>
               </w:rPr>
@@ -3534,6 +3647,7 @@
             <w:r>
               <w:rPr>
                 <w:b/>
+                <w:i w:val="0"/>
                 <w:sz w:val="18"/>
                 <w:rFonts w:ascii="맑은 고딕" w:hAnsi="맑은 고딕" w:eastAsia="맑은 고딕" w:cs="맑은 고딕"/>
               </w:rPr>
@@ -3552,6 +3666,7 @@
             <w:r>
               <w:rPr>
                 <w:b w:val="0"/>
+                <w:i w:val="0"/>
                 <w:sz w:val="18"/>
                 <w:rFonts w:ascii="맑은 고딕" w:hAnsi="맑은 고딕" w:eastAsia="맑은 고딕" w:cs="맑은 고딕"/>
               </w:rPr>
@@ -3643,6 +3758,7 @@
             <w:r>
               <w:rPr>
                 <w:b/>
+                <w:i w:val="0"/>
                 <w:sz w:val="18"/>
                 <w:rFonts w:ascii="맑은 고딕" w:hAnsi="맑은 고딕" w:eastAsia="맑은 고딕" w:cs="맑은 고딕"/>
               </w:rPr>
@@ -3661,6 +3777,7 @@
             <w:r>
               <w:rPr>
                 <w:b w:val="0"/>
+                <w:i w:val="0"/>
                 <w:sz w:val="18"/>
                 <w:rFonts w:ascii="맑은 고딕" w:hAnsi="맑은 고딕" w:eastAsia="맑은 고딕" w:cs="맑은 고딕"/>
               </w:rPr>
@@ -3669,6 +3786,7 @@
             <w:r>
               <w:rPr>
                 <w:b/>
+                <w:i w:val="0"/>
                 <w:sz w:val="18"/>
                 <w:rFonts w:ascii="맑은 고딕" w:hAnsi="맑은 고딕" w:eastAsia="맑은 고딕" w:cs="맑은 고딕"/>
               </w:rPr>
@@ -3677,6 +3795,7 @@
             <w:r>
               <w:rPr>
                 <w:b w:val="0"/>
+                <w:i w:val="0"/>
                 <w:sz w:val="18"/>
                 <w:rFonts w:ascii="맑은 고딕" w:hAnsi="맑은 고딕" w:eastAsia="맑은 고딕" w:cs="맑은 고딕"/>
               </w:rPr>
@@ -3685,6 +3804,7 @@
             <w:r>
               <w:rPr>
                 <w:b/>
+                <w:i w:val="0"/>
                 <w:sz w:val="18"/>
                 <w:rFonts w:ascii="맑은 고딕" w:hAnsi="맑은 고딕" w:eastAsia="맑은 고딕" w:cs="맑은 고딕"/>
               </w:rPr>
@@ -3693,6 +3813,7 @@
             <w:r>
               <w:rPr>
                 <w:b w:val="0"/>
+                <w:i w:val="0"/>
                 <w:sz w:val="18"/>
                 <w:rFonts w:ascii="맑은 고딕" w:hAnsi="맑은 고딕" w:eastAsia="맑은 고딕" w:cs="맑은 고딕"/>
               </w:rPr>
@@ -3714,6 +3835,7 @@
             <w:r>
               <w:rPr>
                 <w:b/>
+                <w:i w:val="0"/>
                 <w:sz w:val="18"/>
                 <w:rFonts w:ascii="맑은 고딕" w:hAnsi="맑은 고딕" w:eastAsia="맑은 고딕" w:cs="맑은 고딕"/>
               </w:rPr>
@@ -3733,6 +3855,7 @@
             <w:r>
               <w:rPr>
                 <w:b w:val="0"/>
+                <w:i w:val="0"/>
                 <w:sz w:val="18"/>
                 <w:rFonts w:ascii="맑은 고딕" w:hAnsi="맑은 고딕" w:eastAsia="맑은 고딕" w:cs="맑은 고딕"/>
               </w:rPr>
@@ -3741,6 +3864,7 @@
             <w:r>
               <w:rPr>
                 <w:b/>
+                <w:i w:val="0"/>
                 <w:sz w:val="18"/>
                 <w:rFonts w:ascii="맑은 고딕" w:hAnsi="맑은 고딕" w:eastAsia="맑은 고딕" w:cs="맑은 고딕"/>
               </w:rPr>
@@ -3897,6 +4021,7 @@
             <w:r>
               <w:rPr>
                 <w:b/>
+                <w:i w:val="0"/>
                 <w:sz w:val="18"/>
                 <w:rFonts w:ascii="맑은 고딕" w:hAnsi="맑은 고딕" w:eastAsia="맑은 고딕" w:cs="맑은 고딕"/>
               </w:rPr>
@@ -3915,6 +4040,7 @@
             <w:r>
               <w:rPr>
                 <w:b w:val="0"/>
+                <w:i w:val="0"/>
                 <w:sz w:val="18"/>
                 <w:rFonts w:ascii="맑은 고딕" w:hAnsi="맑은 고딕" w:eastAsia="맑은 고딕" w:cs="맑은 고딕"/>
               </w:rPr>
@@ -3933,6 +4059,7 @@
             <w:r>
               <w:rPr>
                 <w:b w:val="0"/>
+                <w:i w:val="0"/>
                 <w:sz w:val="18"/>
                 <w:rFonts w:ascii="맑은 고딕" w:hAnsi="맑은 고딕" w:eastAsia="맑은 고딕" w:cs="맑은 고딕"/>
               </w:rPr>
@@ -3954,6 +4081,7 @@
             <w:r>
               <w:rPr>
                 <w:b/>
+                <w:i w:val="0"/>
                 <w:sz w:val="18"/>
                 <w:rFonts w:ascii="맑은 고딕" w:hAnsi="맑은 고딕" w:eastAsia="맑은 고딕" w:cs="맑은 고딕"/>
               </w:rPr>
@@ -3973,6 +4101,7 @@
             <w:r>
               <w:rPr>
                 <w:b w:val="0"/>
+                <w:i w:val="0"/>
                 <w:sz w:val="18"/>
                 <w:rFonts w:ascii="맑은 고딕" w:hAnsi="맑은 고딕" w:eastAsia="맑은 고딕" w:cs="맑은 고딕"/>
               </w:rPr>
@@ -3992,6 +4121,7 @@
             <w:r>
               <w:rPr>
                 <w:b w:val="0"/>
+                <w:i w:val="0"/>
                 <w:sz w:val="18"/>
                 <w:rFonts w:ascii="맑은 고딕" w:hAnsi="맑은 고딕" w:eastAsia="맑은 고딕" w:cs="맑은 고딕"/>
               </w:rPr>
@@ -4000,6 +4130,7 @@
             <w:r>
               <w:rPr>
                 <w:b/>
+                <w:i w:val="0"/>
                 <w:sz w:val="18"/>
                 <w:rFonts w:ascii="맑은 고딕" w:hAnsi="맑은 고딕" w:eastAsia="맑은 고딕" w:cs="맑은 고딕"/>
               </w:rPr>
@@ -4008,6 +4139,7 @@
             <w:r>
               <w:rPr>
                 <w:b w:val="0"/>
+                <w:i w:val="0"/>
                 <w:sz w:val="18"/>
                 <w:rFonts w:ascii="맑은 고딕" w:hAnsi="맑은 고딕" w:eastAsia="맑은 고딕" w:cs="맑은 고딕"/>
               </w:rPr>
@@ -4028,6 +4160,7 @@
             <w:r>
               <w:rPr>
                 <w:b/>
+                <w:i w:val="0"/>
                 <w:sz w:val="18"/>
                 <w:rFonts w:ascii="맑은 고딕" w:hAnsi="맑은 고딕" w:eastAsia="맑은 고딕" w:cs="맑은 고딕"/>
               </w:rPr>
@@ -4046,6 +4179,7 @@
             <w:r>
               <w:rPr>
                 <w:b w:val="0"/>
+                <w:i w:val="0"/>
                 <w:sz w:val="18"/>
                 <w:rFonts w:ascii="맑은 고딕" w:hAnsi="맑은 고딕" w:eastAsia="맑은 고딕" w:cs="맑은 고딕"/>
               </w:rPr>
@@ -4064,6 +4198,7 @@
             <w:r>
               <w:rPr>
                 <w:b w:val="0"/>
+                <w:i w:val="0"/>
                 <w:sz w:val="18"/>
                 <w:rFonts w:ascii="맑은 고딕" w:hAnsi="맑은 고딕" w:eastAsia="맑은 고딕" w:cs="맑은 고딕"/>
               </w:rPr>
@@ -4085,6 +4220,7 @@
             <w:r>
               <w:rPr>
                 <w:b/>
+                <w:i w:val="0"/>
                 <w:sz w:val="18"/>
                 <w:rFonts w:ascii="맑은 고딕" w:hAnsi="맑은 고딕" w:eastAsia="맑은 고딕" w:cs="맑은 고딕"/>
               </w:rPr>
@@ -4104,6 +4240,7 @@
             <w:r>
               <w:rPr>
                 <w:b/>
+                <w:i w:val="0"/>
                 <w:sz w:val="18"/>
                 <w:rFonts w:ascii="맑은 고딕" w:hAnsi="맑은 고딕" w:eastAsia="맑은 고딕" w:cs="맑은 고딕"/>
               </w:rPr>
@@ -4123,6 +4260,7 @@
             <w:r>
               <w:rPr>
                 <w:b w:val="0"/>
+                <w:i w:val="0"/>
                 <w:sz w:val="18"/>
                 <w:rFonts w:ascii="맑은 고딕" w:hAnsi="맑은 고딕" w:eastAsia="맑은 고딕" w:cs="맑은 고딕"/>
               </w:rPr>
@@ -4258,6 +4396,7 @@
             <w:r>
               <w:rPr>
                 <w:b/>
+                <w:i w:val="0"/>
                 <w:sz w:val="18"/>
                 <w:rFonts w:ascii="맑은 고딕" w:hAnsi="맑은 고딕" w:eastAsia="맑은 고딕" w:cs="맑은 고딕"/>
               </w:rPr>
@@ -4276,6 +4415,7 @@
             <w:r>
               <w:rPr>
                 <w:b w:val="0"/>
+                <w:i w:val="0"/>
                 <w:sz w:val="18"/>
                 <w:rFonts w:ascii="맑은 고딕" w:hAnsi="맑은 고딕" w:eastAsia="맑은 고딕" w:cs="맑은 고딕"/>
               </w:rPr>
@@ -4284,6 +4424,7 @@
             <w:r>
               <w:rPr>
                 <w:b/>
+                <w:i w:val="0"/>
                 <w:sz w:val="18"/>
                 <w:rFonts w:ascii="맑은 고딕" w:hAnsi="맑은 고딕" w:eastAsia="맑은 고딕" w:cs="맑은 고딕"/>
               </w:rPr>
@@ -4292,6 +4433,7 @@
             <w:r>
               <w:rPr>
                 <w:b w:val="0"/>
+                <w:i w:val="0"/>
                 <w:sz w:val="18"/>
                 <w:rFonts w:ascii="맑은 고딕" w:hAnsi="맑은 고딕" w:eastAsia="맑은 고딕" w:cs="맑은 고딕"/>
               </w:rPr>
@@ -4313,6 +4455,7 @@
             <w:r>
               <w:rPr>
                 <w:b/>
+                <w:i w:val="0"/>
                 <w:sz w:val="18"/>
                 <w:rFonts w:ascii="맑은 고딕" w:hAnsi="맑은 고딕" w:eastAsia="맑은 고딕" w:cs="맑은 고딕"/>
               </w:rPr>
@@ -4332,6 +4475,7 @@
             <w:r>
               <w:rPr>
                 <w:b w:val="0"/>
+                <w:i w:val="0"/>
                 <w:sz w:val="18"/>
                 <w:rFonts w:ascii="맑은 고딕" w:hAnsi="맑은 고딕" w:eastAsia="맑은 고딕" w:cs="맑은 고딕"/>
               </w:rPr>
@@ -4340,6 +4484,7 @@
             <w:r>
               <w:rPr>
                 <w:b/>
+                <w:i w:val="0"/>
                 <w:sz w:val="18"/>
                 <w:rFonts w:ascii="맑은 고딕" w:hAnsi="맑은 고딕" w:eastAsia="맑은 고딕" w:cs="맑은 고딕"/>
               </w:rPr>
@@ -4360,6 +4505,7 @@
             <w:r>
               <w:rPr>
                 <w:b/>
+                <w:i w:val="0"/>
                 <w:sz w:val="18"/>
                 <w:rFonts w:ascii="맑은 고딕" w:hAnsi="맑은 고딕" w:eastAsia="맑은 고딕" w:cs="맑은 고딕"/>
               </w:rPr>
@@ -4378,6 +4524,7 @@
             <w:r>
               <w:rPr>
                 <w:b w:val="0"/>
+                <w:i w:val="0"/>
                 <w:sz w:val="18"/>
                 <w:rFonts w:ascii="맑은 고딕" w:hAnsi="맑은 고딕" w:eastAsia="맑은 고딕" w:cs="맑은 고딕"/>
               </w:rPr>
@@ -4386,6 +4533,7 @@
             <w:r>
               <w:rPr>
                 <w:b/>
+                <w:i w:val="0"/>
                 <w:sz w:val="18"/>
                 <w:rFonts w:ascii="맑은 고딕" w:hAnsi="맑은 고딕" w:eastAsia="맑은 고딕" w:cs="맑은 고딕"/>
               </w:rPr>
@@ -4407,6 +4555,7 @@
             <w:r>
               <w:rPr>
                 <w:b/>
+                <w:i w:val="0"/>
                 <w:sz w:val="18"/>
                 <w:rFonts w:ascii="맑은 고딕" w:hAnsi="맑은 고딕" w:eastAsia="맑은 고딕" w:cs="맑은 고딕"/>
               </w:rPr>
@@ -4426,6 +4575,7 @@
             <w:r>
               <w:rPr>
                 <w:b w:val="0"/>
+                <w:i w:val="0"/>
                 <w:sz w:val="18"/>
                 <w:rFonts w:ascii="맑은 고딕" w:hAnsi="맑은 고딕" w:eastAsia="맑은 고딕" w:cs="맑은 고딕"/>
               </w:rPr>
@@ -4434,6 +4584,7 @@
             <w:r>
               <w:rPr>
                 <w:b/>
+                <w:i w:val="0"/>
                 <w:sz w:val="18"/>
                 <w:rFonts w:ascii="맑은 고딕" w:hAnsi="맑은 고딕" w:eastAsia="맑은 고딕" w:cs="맑은 고딕"/>
               </w:rPr>
@@ -4602,6 +4753,8 @@
       </w:r>
       <w:r>
         <w:rPr>
+          <w:b w:val="0"/>
+          <w:i w:val="0"/>
           <w:sz w:val="20"/>
           <w:rFonts w:ascii="맑은 고딕" w:hAnsi="맑은 고딕" w:eastAsia="맑은 고딕" w:cs="맑은 고딕"/>
         </w:rPr>
@@ -4624,6 +4777,8 @@
       </w:r>
       <w:r>
         <w:rPr>
+          <w:b w:val="0"/>
+          <w:i w:val="0"/>
           <w:sz w:val="20"/>
           <w:rFonts w:ascii="맑은 고딕" w:hAnsi="맑은 고딕" w:eastAsia="맑은 고딕" w:cs="맑은 고딕"/>
         </w:rPr>
@@ -4729,6 +4884,7 @@
             <w:r>
               <w:rPr>
                 <w:b/>
+                <w:i w:val="0"/>
                 <w:sz w:val="18"/>
                 <w:rFonts w:ascii="맑은 고딕" w:hAnsi="맑은 고딕" w:eastAsia="맑은 고딕" w:cs="맑은 고딕"/>
               </w:rPr>
@@ -4747,6 +4903,7 @@
             <w:r>
               <w:rPr>
                 <w:b w:val="0"/>
+                <w:i w:val="0"/>
                 <w:sz w:val="18"/>
                 <w:rFonts w:ascii="맑은 고딕" w:hAnsi="맑은 고딕" w:eastAsia="맑은 고딕" w:cs="맑은 고딕"/>
               </w:rPr>
@@ -4755,6 +4912,7 @@
             <w:r>
               <w:rPr>
                 <w:b/>
+                <w:i w:val="0"/>
                 <w:sz w:val="18"/>
                 <w:rFonts w:ascii="맑은 고딕" w:hAnsi="맑은 고딕" w:eastAsia="맑은 고딕" w:cs="맑은 고딕"/>
               </w:rPr>
@@ -4763,6 +4921,7 @@
             <w:r>
               <w:rPr>
                 <w:b w:val="0"/>
+                <w:i w:val="0"/>
                 <w:sz w:val="18"/>
                 <w:rFonts w:ascii="맑은 고딕" w:hAnsi="맑은 고딕" w:eastAsia="맑은 고딕" w:cs="맑은 고딕"/>
               </w:rPr>
@@ -4784,6 +4943,7 @@
             <w:r>
               <w:rPr>
                 <w:b/>
+                <w:i w:val="0"/>
                 <w:sz w:val="18"/>
                 <w:rFonts w:ascii="맑은 고딕" w:hAnsi="맑은 고딕" w:eastAsia="맑은 고딕" w:cs="맑은 고딕"/>
               </w:rPr>
@@ -4803,6 +4963,7 @@
             <w:r>
               <w:rPr>
                 <w:b w:val="0"/>
+                <w:i w:val="0"/>
                 <w:sz w:val="18"/>
                 <w:rFonts w:ascii="맑은 고딕" w:hAnsi="맑은 고딕" w:eastAsia="맑은 고딕" w:cs="맑은 고딕"/>
               </w:rPr>
@@ -4823,6 +4984,7 @@
             <w:r>
               <w:rPr>
                 <w:b/>
+                <w:i w:val="0"/>
                 <w:sz w:val="18"/>
                 <w:rFonts w:ascii="맑은 고딕" w:hAnsi="맑은 고딕" w:eastAsia="맑은 고딕" w:cs="맑은 고딕"/>
               </w:rPr>
@@ -4841,6 +5003,7 @@
             <w:r>
               <w:rPr>
                 <w:b w:val="0"/>
+                <w:i w:val="0"/>
                 <w:sz w:val="18"/>
                 <w:rFonts w:ascii="맑은 고딕" w:hAnsi="맑은 고딕" w:eastAsia="맑은 고딕" w:cs="맑은 고딕"/>
               </w:rPr>
@@ -4945,6 +5108,7 @@
             <w:r>
               <w:rPr>
                 <w:b/>
+                <w:i w:val="0"/>
                 <w:sz w:val="18"/>
                 <w:rFonts w:ascii="맑은 고딕" w:hAnsi="맑은 고딕" w:eastAsia="맑은 고딕" w:cs="맑은 고딕"/>
               </w:rPr>
@@ -4963,6 +5127,7 @@
             <w:r>
               <w:rPr>
                 <w:b/>
+                <w:i w:val="0"/>
                 <w:sz w:val="18"/>
                 <w:rFonts w:ascii="맑은 고딕" w:hAnsi="맑은 고딕" w:eastAsia="맑은 고딕" w:cs="맑은 고딕"/>
               </w:rPr>
@@ -4981,6 +5146,7 @@
             <w:r>
               <w:rPr>
                 <w:b w:val="0"/>
+                <w:i w:val="0"/>
                 <w:sz w:val="18"/>
                 <w:rFonts w:ascii="맑은 고딕" w:hAnsi="맑은 고딕" w:eastAsia="맑은 고딕" w:cs="맑은 고딕"/>
               </w:rPr>
@@ -5002,6 +5168,7 @@
             <w:r>
               <w:rPr>
                 <w:b/>
+                <w:i w:val="0"/>
                 <w:sz w:val="18"/>
                 <w:rFonts w:ascii="맑은 고딕" w:hAnsi="맑은 고딕" w:eastAsia="맑은 고딕" w:cs="맑은 고딕"/>
               </w:rPr>
@@ -5021,6 +5188,7 @@
             <w:r>
               <w:rPr>
                 <w:b/>
+                <w:i w:val="0"/>
                 <w:sz w:val="18"/>
                 <w:rFonts w:ascii="맑은 고딕" w:hAnsi="맑은 고딕" w:eastAsia="맑은 고딕" w:cs="맑은 고딕"/>
               </w:rPr>
@@ -5040,6 +5208,7 @@
             <w:r>
               <w:rPr>
                 <w:b/>
+                <w:i w:val="0"/>
                 <w:sz w:val="18"/>
                 <w:rFonts w:ascii="맑은 고딕" w:hAnsi="맑은 고딕" w:eastAsia="맑은 고딕" w:cs="맑은 고딕"/>
               </w:rPr>
@@ -5048,6 +5217,7 @@
             <w:r>
               <w:rPr>
                 <w:b w:val="0"/>
+                <w:i w:val="0"/>
                 <w:sz w:val="18"/>
                 <w:rFonts w:ascii="맑은 고딕" w:hAnsi="맑은 고딕" w:eastAsia="맑은 고딕" w:cs="맑은 고딕"/>
               </w:rPr>
@@ -5068,6 +5238,7 @@
             <w:r>
               <w:rPr>
                 <w:b/>
+                <w:i w:val="0"/>
                 <w:sz w:val="18"/>
                 <w:rFonts w:ascii="맑은 고딕" w:hAnsi="맑은 고딕" w:eastAsia="맑은 고딕" w:cs="맑은 고딕"/>
               </w:rPr>
@@ -5086,6 +5257,7 @@
             <w:r>
               <w:rPr>
                 <w:b/>
+                <w:i w:val="0"/>
                 <w:sz w:val="18"/>
                 <w:rFonts w:ascii="맑은 고딕" w:hAnsi="맑은 고딕" w:eastAsia="맑은 고딕" w:cs="맑은 고딕"/>
               </w:rPr>
@@ -5104,6 +5276,7 @@
             <w:r>
               <w:rPr>
                 <w:b w:val="0"/>
+                <w:i w:val="0"/>
                 <w:sz w:val="18"/>
                 <w:rFonts w:ascii="맑은 고딕" w:hAnsi="맑은 고딕" w:eastAsia="맑은 고딕" w:cs="맑은 고딕"/>
               </w:rPr>
@@ -5239,6 +5412,7 @@
             <w:r>
               <w:rPr>
                 <w:b w:val="0"/>
+                <w:i w:val="0"/>
                 <w:sz w:val="18"/>
                 <w:rFonts w:ascii="맑은 고딕" w:hAnsi="맑은 고딕" w:eastAsia="맑은 고딕" w:cs="맑은 고딕"/>
               </w:rPr>
@@ -5247,6 +5421,7 @@
             <w:r>
               <w:rPr>
                 <w:b/>
+                <w:i w:val="0"/>
                 <w:sz w:val="18"/>
                 <w:rFonts w:ascii="맑은 고딕" w:hAnsi="맑은 고딕" w:eastAsia="맑은 고딕" w:cs="맑은 고딕"/>
               </w:rPr>
@@ -5265,6 +5440,7 @@
             <w:r>
               <w:rPr>
                 <w:b w:val="0"/>
+                <w:i w:val="0"/>
                 <w:sz w:val="18"/>
                 <w:rFonts w:ascii="맑은 고딕" w:hAnsi="맑은 고딕" w:eastAsia="맑은 고딕" w:cs="맑은 고딕"/>
               </w:rPr>
@@ -5286,6 +5462,7 @@
             <w:r>
               <w:rPr>
                 <w:b w:val="0"/>
+                <w:i w:val="0"/>
                 <w:sz w:val="18"/>
                 <w:rFonts w:ascii="맑은 고딕" w:hAnsi="맑은 고딕" w:eastAsia="맑은 고딕" w:cs="맑은 고딕"/>
               </w:rPr>
@@ -5294,6 +5471,7 @@
             <w:r>
               <w:rPr>
                 <w:b/>
+                <w:i w:val="0"/>
                 <w:sz w:val="18"/>
                 <w:rFonts w:ascii="맑은 고딕" w:hAnsi="맑은 고딕" w:eastAsia="맑은 고딕" w:cs="맑은 고딕"/>
               </w:rPr>
@@ -5302,6 +5480,7 @@
             <w:r>
               <w:rPr>
                 <w:b w:val="0"/>
+                <w:i w:val="0"/>
                 <w:sz w:val="18"/>
                 <w:rFonts w:ascii="맑은 고딕" w:hAnsi="맑은 고딕" w:eastAsia="맑은 고딕" w:cs="맑은 고딕"/>
               </w:rPr>
@@ -5321,6 +5500,7 @@
             <w:r>
               <w:rPr>
                 <w:b w:val="0"/>
+                <w:i w:val="0"/>
                 <w:sz w:val="18"/>
                 <w:rFonts w:ascii="맑은 고딕" w:hAnsi="맑은 고딕" w:eastAsia="맑은 고딕" w:cs="맑은 고딕"/>
               </w:rPr>
@@ -5329,6 +5509,7 @@
             <w:r>
               <w:rPr>
                 <w:b/>
+                <w:i w:val="0"/>
                 <w:sz w:val="18"/>
                 <w:rFonts w:ascii="맑은 고딕" w:hAnsi="맑은 고딕" w:eastAsia="맑은 고딕" w:cs="맑은 고딕"/>
               </w:rPr>
@@ -5510,6 +5691,8 @@
       </w:r>
       <w:r>
         <w:rPr>
+          <w:b w:val="0"/>
+          <w:i w:val="0"/>
           <w:sz w:val="20"/>
           <w:rFonts w:ascii="맑은 고딕" w:hAnsi="맑은 고딕" w:eastAsia="맑은 고딕" w:cs="맑은 고딕"/>
         </w:rPr>
@@ -5532,6 +5715,8 @@
       </w:r>
       <w:r>
         <w:rPr>
+          <w:b w:val="0"/>
+          <w:i w:val="0"/>
           <w:sz w:val="20"/>
           <w:rFonts w:ascii="맑은 고딕" w:hAnsi="맑은 고딕" w:eastAsia="맑은 고딕" w:cs="맑은 고딕"/>
         </w:rPr>
@@ -5554,6 +5739,8 @@
       </w:r>
       <w:r>
         <w:rPr>
+          <w:b w:val="0"/>
+          <w:i w:val="0"/>
           <w:sz w:val="20"/>
           <w:rFonts w:ascii="맑은 고딕" w:hAnsi="맑은 고딕" w:eastAsia="맑은 고딕" w:cs="맑은 고딕"/>
         </w:rPr>
@@ -5629,6 +5816,7 @@
             <w:r>
               <w:rPr>
                 <w:b w:val="0"/>
+                <w:i w:val="0"/>
                 <w:sz w:val="18"/>
                 <w:rFonts w:ascii="맑은 고딕" w:hAnsi="맑은 고딕" w:eastAsia="맑은 고딕" w:cs="맑은 고딕"/>
               </w:rPr>
@@ -5647,6 +5835,7 @@
             <w:r>
               <w:rPr>
                 <w:b w:val="0"/>
+                <w:i w:val="0"/>
                 <w:sz w:val="18"/>
                 <w:rFonts w:ascii="맑은 고딕" w:hAnsi="맑은 고딕" w:eastAsia="맑은 고딕" w:cs="맑은 고딕"/>
               </w:rPr>
@@ -5668,6 +5857,7 @@
             <w:r>
               <w:rPr>
                 <w:b w:val="0"/>
+                <w:i w:val="0"/>
                 <w:sz w:val="18"/>
                 <w:rFonts w:ascii="맑은 고딕" w:hAnsi="맑은 고딕" w:eastAsia="맑은 고딕" w:cs="맑은 고딕"/>
               </w:rPr>
@@ -5687,6 +5877,7 @@
             <w:r>
               <w:rPr>
                 <w:b w:val="0"/>
+                <w:i w:val="0"/>
                 <w:sz w:val="18"/>
                 <w:rFonts w:ascii="맑은 고딕" w:hAnsi="맑은 고딕" w:eastAsia="맑은 고딕" w:cs="맑은 고딕"/>
               </w:rPr>
@@ -5707,6 +5898,7 @@
             <w:r>
               <w:rPr>
                 <w:b w:val="0"/>
+                <w:i w:val="0"/>
                 <w:sz w:val="18"/>
                 <w:rFonts w:ascii="맑은 고딕" w:hAnsi="맑은 고딕" w:eastAsia="맑은 고딕" w:cs="맑은 고딕"/>
               </w:rPr>
@@ -5725,6 +5917,7 @@
             <w:r>
               <w:rPr>
                 <w:b/>
+                <w:i w:val="0"/>
                 <w:sz w:val="18"/>
                 <w:rFonts w:ascii="맑은 고딕" w:hAnsi="맑은 고딕" w:eastAsia="맑은 고딕" w:cs="맑은 고딕"/>
               </w:rPr>
@@ -5858,6 +6051,7 @@
             <w:r>
               <w:rPr>
                 <w:b/>
+                <w:i w:val="0"/>
                 <w:sz w:val="18"/>
                 <w:rFonts w:ascii="맑은 고딕" w:hAnsi="맑은 고딕" w:eastAsia="맑은 고딕" w:cs="맑은 고딕"/>
               </w:rPr>
@@ -5876,6 +6070,7 @@
             <w:r>
               <w:rPr>
                 <w:b/>
+                <w:i w:val="0"/>
                 <w:sz w:val="18"/>
                 <w:rFonts w:ascii="맑은 고딕" w:hAnsi="맑은 고딕" w:eastAsia="맑은 고딕" w:cs="맑은 고딕"/>
               </w:rPr>
@@ -5894,6 +6089,7 @@
             <w:r>
               <w:rPr>
                 <w:b/>
+                <w:i w:val="0"/>
                 <w:sz w:val="18"/>
                 <w:rFonts w:ascii="맑은 고딕" w:hAnsi="맑은 고딕" w:eastAsia="맑은 고딕" w:cs="맑은 고딕"/>
               </w:rPr>
@@ -5912,6 +6108,7 @@
             <w:r>
               <w:rPr>
                 <w:b w:val="0"/>
+                <w:i w:val="0"/>
                 <w:sz w:val="18"/>
                 <w:rFonts w:ascii="맑은 고딕" w:hAnsi="맑은 고딕" w:eastAsia="맑은 고딕" w:cs="맑은 고딕"/>
               </w:rPr>
@@ -5933,6 +6130,7 @@
             <w:r>
               <w:rPr>
                 <w:b/>
+                <w:i w:val="0"/>
                 <w:sz w:val="18"/>
                 <w:rFonts w:ascii="맑은 고딕" w:hAnsi="맑은 고딕" w:eastAsia="맑은 고딕" w:cs="맑은 고딕"/>
               </w:rPr>
@@ -5952,6 +6150,7 @@
             <w:r>
               <w:rPr>
                 <w:b w:val="0"/>
+                <w:i w:val="0"/>
                 <w:sz w:val="18"/>
                 <w:rFonts w:ascii="맑은 고딕" w:hAnsi="맑은 고딕" w:eastAsia="맑은 고딕" w:cs="맑은 고딕"/>
               </w:rPr>
@@ -5971,6 +6170,7 @@
             <w:r>
               <w:rPr>
                 <w:b/>
+                <w:i w:val="0"/>
                 <w:sz w:val="18"/>
                 <w:rFonts w:ascii="맑은 고딕" w:hAnsi="맑은 고딕" w:eastAsia="맑은 고딕" w:cs="맑은 고딕"/>
               </w:rPr>
@@ -5979,6 +6179,7 @@
             <w:r>
               <w:rPr>
                 <w:b w:val="0"/>
+                <w:i w:val="0"/>
                 <w:sz w:val="18"/>
                 <w:rFonts w:ascii="맑은 고딕" w:hAnsi="맑은 고딕" w:eastAsia="맑은 고딕" w:cs="맑은 고딕"/>
               </w:rPr>
@@ -5998,6 +6199,7 @@
             <w:r>
               <w:rPr>
                 <w:b w:val="0"/>
+                <w:i w:val="0"/>
                 <w:sz w:val="18"/>
                 <w:rFonts w:ascii="맑은 고딕" w:hAnsi="맑은 고딕" w:eastAsia="맑은 고딕" w:cs="맑은 고딕"/>
               </w:rPr>
@@ -6018,6 +6220,7 @@
             <w:r>
               <w:rPr>
                 <w:b/>
+                <w:i w:val="0"/>
                 <w:sz w:val="18"/>
                 <w:rFonts w:ascii="맑은 고딕" w:hAnsi="맑은 고딕" w:eastAsia="맑은 고딕" w:cs="맑은 고딕"/>
               </w:rPr>
@@ -6036,6 +6239,7 @@
             <w:r>
               <w:rPr>
                 <w:b w:val="0"/>
+                <w:i w:val="0"/>
                 <w:sz w:val="18"/>
                 <w:rFonts w:ascii="맑은 고딕" w:hAnsi="맑은 고딕" w:eastAsia="맑은 고딕" w:cs="맑은 고딕"/>
               </w:rPr>
@@ -6054,6 +6258,7 @@
             <w:r>
               <w:rPr>
                 <w:b w:val="0"/>
+                <w:i w:val="0"/>
                 <w:sz w:val="18"/>
                 <w:rFonts w:ascii="맑은 고딕" w:hAnsi="맑은 고딕" w:eastAsia="맑은 고딕" w:cs="맑은 고딕"/>
               </w:rPr>
@@ -6072,6 +6277,7 @@
             <w:r>
               <w:rPr>
                 <w:b w:val="0"/>
+                <w:i w:val="0"/>
                 <w:sz w:val="18"/>
                 <w:rFonts w:ascii="맑은 고딕" w:hAnsi="맑은 고딕" w:eastAsia="맑은 고딕" w:cs="맑은 고딕"/>
               </w:rPr>
@@ -6221,6 +6427,7 @@
             <w:r>
               <w:rPr>
                 <w:b w:val="0"/>
+                <w:i w:val="0"/>
                 <w:sz w:val="18"/>
                 <w:rFonts w:ascii="맑은 고딕" w:hAnsi="맑은 고딕" w:eastAsia="맑은 고딕" w:cs="맑은 고딕"/>
               </w:rPr>
@@ -6239,6 +6446,7 @@
             <w:r>
               <w:rPr>
                 <w:b w:val="0"/>
+                <w:i w:val="0"/>
                 <w:sz w:val="18"/>
                 <w:rFonts w:ascii="맑은 고딕" w:hAnsi="맑은 고딕" w:eastAsia="맑은 고딕" w:cs="맑은 고딕"/>
               </w:rPr>
@@ -6260,6 +6468,7 @@
             <w:r>
               <w:rPr>
                 <w:b w:val="0"/>
+                <w:i w:val="0"/>
                 <w:sz w:val="18"/>
                 <w:rFonts w:ascii="맑은 고딕" w:hAnsi="맑은 고딕" w:eastAsia="맑은 고딕" w:cs="맑은 고딕"/>
               </w:rPr>
@@ -6279,6 +6488,7 @@
             <w:r>
               <w:rPr>
                 <w:b w:val="0"/>
+                <w:i w:val="0"/>
                 <w:sz w:val="18"/>
                 <w:rFonts w:ascii="맑은 고딕" w:hAnsi="맑은 고딕" w:eastAsia="맑은 고딕" w:cs="맑은 고딕"/>
               </w:rPr>
@@ -6299,6 +6509,7 @@
             <w:r>
               <w:rPr>
                 <w:b w:val="0"/>
+                <w:i w:val="0"/>
                 <w:sz w:val="18"/>
                 <w:rFonts w:ascii="맑은 고딕" w:hAnsi="맑은 고딕" w:eastAsia="맑은 고딕" w:cs="맑은 고딕"/>
               </w:rPr>
@@ -6317,6 +6528,7 @@
             <w:r>
               <w:rPr>
                 <w:b w:val="0"/>
+                <w:i w:val="0"/>
                 <w:sz w:val="18"/>
                 <w:rFonts w:ascii="맑은 고딕" w:hAnsi="맑은 고딕" w:eastAsia="맑은 고딕" w:cs="맑은 고딕"/>
               </w:rPr>
@@ -6487,6 +6699,7 @@
             <w:r>
               <w:rPr>
                 <w:b/>
+                <w:i w:val="0"/>
                 <w:sz w:val="18"/>
                 <w:rFonts w:ascii="맑은 고딕" w:hAnsi="맑은 고딕" w:eastAsia="맑은 고딕" w:cs="맑은 고딕"/>
               </w:rPr>
@@ -6505,6 +6718,7 @@
             <w:r>
               <w:rPr>
                 <w:b/>
+                <w:i w:val="0"/>
                 <w:sz w:val="18"/>
                 <w:rFonts w:ascii="맑은 고딕" w:hAnsi="맑은 고딕" w:eastAsia="맑은 고딕" w:cs="맑은 고딕"/>
               </w:rPr>
@@ -6523,6 +6737,7 @@
             <w:r>
               <w:rPr>
                 <w:b w:val="0"/>
+                <w:i w:val="0"/>
                 <w:sz w:val="18"/>
                 <w:rFonts w:ascii="맑은 고딕" w:hAnsi="맑은 고딕" w:eastAsia="맑은 고딕" w:cs="맑은 고딕"/>
               </w:rPr>
@@ -6531,6 +6746,7 @@
             <w:r>
               <w:rPr>
                 <w:b/>
+                <w:i w:val="0"/>
                 <w:sz w:val="18"/>
                 <w:rFonts w:ascii="맑은 고딕" w:hAnsi="맑은 고딕" w:eastAsia="맑은 고딕" w:cs="맑은 고딕"/>
               </w:rPr>
@@ -6539,6 +6755,7 @@
             <w:r>
               <w:rPr>
                 <w:b w:val="0"/>
+                <w:i w:val="0"/>
                 <w:sz w:val="18"/>
                 <w:rFonts w:ascii="맑은 고딕" w:hAnsi="맑은 고딕" w:eastAsia="맑은 고딕" w:cs="맑은 고딕"/>
               </w:rPr>
@@ -6560,6 +6777,7 @@
             <w:r>
               <w:rPr>
                 <w:b/>
+                <w:i w:val="0"/>
                 <w:sz w:val="18"/>
                 <w:rFonts w:ascii="맑은 고딕" w:hAnsi="맑은 고딕" w:eastAsia="맑은 고딕" w:cs="맑은 고딕"/>
               </w:rPr>
@@ -6579,6 +6797,7 @@
             <w:r>
               <w:rPr>
                 <w:b/>
+                <w:i w:val="0"/>
                 <w:sz w:val="18"/>
                 <w:rFonts w:ascii="맑은 고딕" w:hAnsi="맑은 고딕" w:eastAsia="맑은 고딕" w:cs="맑은 고딕"/>
               </w:rPr>
@@ -6598,6 +6817,7 @@
             <w:r>
               <w:rPr>
                 <w:b w:val="0"/>
+                <w:i w:val="0"/>
                 <w:sz w:val="18"/>
                 <w:rFonts w:ascii="맑은 고딕" w:hAnsi="맑은 고딕" w:eastAsia="맑은 고딕" w:cs="맑은 고딕"/>
               </w:rPr>
@@ -6618,6 +6838,7 @@
             <w:r>
               <w:rPr>
                 <w:b/>
+                <w:i w:val="0"/>
                 <w:sz w:val="18"/>
                 <w:rFonts w:ascii="맑은 고딕" w:hAnsi="맑은 고딕" w:eastAsia="맑은 고딕" w:cs="맑은 고딕"/>
               </w:rPr>
@@ -6636,6 +6857,7 @@
             <w:r>
               <w:rPr>
                 <w:b/>
+                <w:i w:val="0"/>
                 <w:sz w:val="18"/>
                 <w:rFonts w:ascii="맑은 고딕" w:hAnsi="맑은 고딕" w:eastAsia="맑은 고딕" w:cs="맑은 고딕"/>
               </w:rPr>
@@ -6654,6 +6876,7 @@
             <w:r>
               <w:rPr>
                 <w:b w:val="0"/>
+                <w:i w:val="0"/>
                 <w:sz w:val="18"/>
                 <w:rFonts w:ascii="맑은 고딕" w:hAnsi="맑은 고딕" w:eastAsia="맑은 고딕" w:cs="맑은 고딕"/>
               </w:rPr>
@@ -6684,6 +6907,8 @@
       </w:r>
       <w:r>
         <w:rPr>
+          <w:b w:val="0"/>
+          <w:i w:val="0"/>
           <w:sz w:val="20"/>
           <w:rFonts w:ascii="맑은 고딕" w:hAnsi="맑은 고딕" w:eastAsia="맑은 고딕" w:cs="맑은 고딕"/>
         </w:rPr>
@@ -6706,6 +6931,8 @@
       </w:r>
       <w:r>
         <w:rPr>
+          <w:b w:val="0"/>
+          <w:i w:val="0"/>
           <w:sz w:val="20"/>
           <w:rFonts w:ascii="맑은 고딕" w:hAnsi="맑은 고딕" w:eastAsia="맑은 고딕" w:cs="맑은 고딕"/>
         </w:rPr>
@@ -6831,6 +7058,7 @@
             <w:r>
               <w:rPr>
                 <w:b/>
+                <w:i w:val="0"/>
                 <w:sz w:val="18"/>
                 <w:rFonts w:ascii="맑은 고딕" w:hAnsi="맑은 고딕" w:eastAsia="맑은 고딕" w:cs="맑은 고딕"/>
               </w:rPr>
@@ -6849,6 +7077,7 @@
             <w:r>
               <w:rPr>
                 <w:b w:val="0"/>
+                <w:i w:val="0"/>
                 <w:sz w:val="18"/>
                 <w:rFonts w:ascii="맑은 고딕" w:hAnsi="맑은 고딕" w:eastAsia="맑은 고딕" w:cs="맑은 고딕"/>
               </w:rPr>
@@ -6867,6 +7096,7 @@
             <w:r>
               <w:rPr>
                 <w:b w:val="0"/>
+                <w:i w:val="0"/>
                 <w:sz w:val="18"/>
                 <w:rFonts w:ascii="맑은 고딕" w:hAnsi="맑은 고딕" w:eastAsia="맑은 고딕" w:cs="맑은 고딕"/>
               </w:rPr>
@@ -6885,6 +7115,7 @@
             <w:r>
               <w:rPr>
                 <w:b w:val="0"/>
+                <w:i w:val="0"/>
                 <w:sz w:val="18"/>
                 <w:rFonts w:ascii="맑은 고딕" w:hAnsi="맑은 고딕" w:eastAsia="맑은 고딕" w:cs="맑은 고딕"/>
               </w:rPr>
@@ -6906,6 +7137,7 @@
             <w:r>
               <w:rPr>
                 <w:b/>
+                <w:i w:val="0"/>
                 <w:sz w:val="18"/>
                 <w:rFonts w:ascii="맑은 고딕" w:hAnsi="맑은 고딕" w:eastAsia="맑은 고딕" w:cs="맑은 고딕"/>
               </w:rPr>
@@ -6925,6 +7157,7 @@
             <w:r>
               <w:rPr>
                 <w:b w:val="0"/>
+                <w:i w:val="0"/>
                 <w:sz w:val="18"/>
                 <w:rFonts w:ascii="맑은 고딕" w:hAnsi="맑은 고딕" w:eastAsia="맑은 고딕" w:cs="맑은 고딕"/>
               </w:rPr>
@@ -6944,6 +7177,7 @@
             <w:r>
               <w:rPr>
                 <w:b w:val="0"/>
+                <w:i w:val="0"/>
                 <w:sz w:val="18"/>
                 <w:rFonts w:ascii="맑은 고딕" w:hAnsi="맑은 고딕" w:eastAsia="맑은 고딕" w:cs="맑은 고딕"/>
               </w:rPr>
@@ -6963,6 +7197,7 @@
             <w:r>
               <w:rPr>
                 <w:b w:val="0"/>
+                <w:i w:val="0"/>
                 <w:sz w:val="18"/>
                 <w:rFonts w:ascii="맑은 고딕" w:hAnsi="맑은 고딕" w:eastAsia="맑은 고딕" w:cs="맑은 고딕"/>
               </w:rPr>
@@ -6983,6 +7218,7 @@
             <w:r>
               <w:rPr>
                 <w:b/>
+                <w:i w:val="0"/>
                 <w:sz w:val="18"/>
                 <w:rFonts w:ascii="맑은 고딕" w:hAnsi="맑은 고딕" w:eastAsia="맑은 고딕" w:cs="맑은 고딕"/>
               </w:rPr>
@@ -7001,6 +7237,7 @@
             <w:r>
               <w:rPr>
                 <w:b w:val="0"/>
+                <w:i w:val="0"/>
                 <w:sz w:val="18"/>
                 <w:rFonts w:ascii="맑은 고딕" w:hAnsi="맑은 고딕" w:eastAsia="맑은 고딕" w:cs="맑은 고딕"/>
               </w:rPr>
@@ -7019,6 +7256,7 @@
             <w:r>
               <w:rPr>
                 <w:b w:val="0"/>
+                <w:i w:val="0"/>
                 <w:sz w:val="18"/>
                 <w:rFonts w:ascii="맑은 고딕" w:hAnsi="맑은 고딕" w:eastAsia="맑은 고딕" w:cs="맑은 고딕"/>
               </w:rPr>
@@ -7037,6 +7275,7 @@
             <w:r>
               <w:rPr>
                 <w:b w:val="0"/>
+                <w:i w:val="0"/>
                 <w:sz w:val="18"/>
                 <w:rFonts w:ascii="맑은 고딕" w:hAnsi="맑은 고딕" w:eastAsia="맑은 고딕" w:cs="맑은 고딕"/>
               </w:rPr>
@@ -7058,6 +7297,7 @@
             <w:r>
               <w:rPr>
                 <w:b/>
+                <w:i w:val="0"/>
                 <w:sz w:val="18"/>
                 <w:rFonts w:ascii="맑은 고딕" w:hAnsi="맑은 고딕" w:eastAsia="맑은 고딕" w:cs="맑은 고딕"/>
               </w:rPr>
@@ -7077,6 +7317,7 @@
             <w:r>
               <w:rPr>
                 <w:b w:val="0"/>
+                <w:i w:val="0"/>
                 <w:sz w:val="18"/>
                 <w:rFonts w:ascii="맑은 고딕" w:hAnsi="맑은 고딕" w:eastAsia="맑은 고딕" w:cs="맑은 고딕"/>
               </w:rPr>
@@ -7096,6 +7337,7 @@
             <w:r>
               <w:rPr>
                 <w:b w:val="0"/>
+                <w:i w:val="0"/>
                 <w:sz w:val="18"/>
                 <w:rFonts w:ascii="맑은 고딕" w:hAnsi="맑은 고딕" w:eastAsia="맑은 고딕" w:cs="맑은 고딕"/>
               </w:rPr>
@@ -7115,6 +7357,7 @@
             <w:r>
               <w:rPr>
                 <w:b w:val="0"/>
+                <w:i w:val="0"/>
                 <w:sz w:val="18"/>
                 <w:rFonts w:ascii="맑은 고딕" w:hAnsi="맑은 고딕" w:eastAsia="맑은 고딕" w:cs="맑은 고딕"/>
               </w:rPr>
@@ -7247,6 +7490,8 @@
       </w:pPr>
       <w:r>
         <w:rPr>
+          <w:b w:val="0"/>
+          <w:i w:val="0"/>
           <w:sz w:val="20"/>
           <w:rFonts w:ascii="맑은 고딕" w:hAnsi="맑은 고딕" w:eastAsia="맑은 고딕" w:cs="맑은 고딕"/>
         </w:rPr>
@@ -7261,6 +7506,8 @@
       </w:pPr>
       <w:r>
         <w:rPr>
+          <w:b w:val="0"/>
+          <w:i w:val="0"/>
           <w:sz w:val="20"/>
           <w:rFonts w:ascii="맑은 고딕" w:hAnsi="맑은 고딕" w:eastAsia="맑은 고딕" w:cs="맑은 고딕"/>
         </w:rPr>
@@ -7275,6 +7522,8 @@
       </w:pPr>
       <w:r>
         <w:rPr>
+          <w:b w:val="0"/>
+          <w:i w:val="0"/>
           <w:sz w:val="20"/>
           <w:rFonts w:ascii="맑은 고딕" w:hAnsi="맑은 고딕" w:eastAsia="맑은 고딕" w:cs="맑은 고딕"/>
         </w:rPr>
@@ -7358,6 +7607,7 @@
             <w:r>
               <w:rPr>
                 <w:b/>
+                <w:i w:val="0"/>
                 <w:sz w:val="18"/>
                 <w:rFonts w:ascii="맑은 고딕" w:hAnsi="맑은 고딕" w:eastAsia="맑은 고딕" w:cs="맑은 고딕"/>
               </w:rPr>
@@ -7376,6 +7626,7 @@
             <w:r>
               <w:rPr>
                 <w:b w:val="0"/>
+                <w:i w:val="0"/>
                 <w:sz w:val="18"/>
                 <w:rFonts w:ascii="맑은 고딕" w:hAnsi="맑은 고딕" w:eastAsia="맑은 고딕" w:cs="맑은 고딕"/>
               </w:rPr>
@@ -7397,6 +7648,7 @@
             <w:r>
               <w:rPr>
                 <w:b/>
+                <w:i w:val="0"/>
                 <w:sz w:val="18"/>
                 <w:rFonts w:ascii="맑은 고딕" w:hAnsi="맑은 고딕" w:eastAsia="맑은 고딕" w:cs="맑은 고딕"/>
               </w:rPr>
@@ -7416,6 +7668,7 @@
             <w:r>
               <w:rPr>
                 <w:b w:val="0"/>
+                <w:i w:val="0"/>
                 <w:sz w:val="18"/>
                 <w:rFonts w:ascii="맑은 고딕" w:hAnsi="맑은 고딕" w:eastAsia="맑은 고딕" w:cs="맑은 고딕"/>
               </w:rPr>
@@ -7436,6 +7689,7 @@
             <w:r>
               <w:rPr>
                 <w:b/>
+                <w:i w:val="0"/>
                 <w:sz w:val="18"/>
                 <w:rFonts w:ascii="맑은 고딕" w:hAnsi="맑은 고딕" w:eastAsia="맑은 고딕" w:cs="맑은 고딕"/>
               </w:rPr>
@@ -7454,6 +7708,7 @@
             <w:r>
               <w:rPr>
                 <w:b w:val="0"/>
+                <w:i w:val="0"/>
                 <w:sz w:val="18"/>
                 <w:rFonts w:ascii="맑은 고딕" w:hAnsi="맑은 고딕" w:eastAsia="맑은 고딕" w:cs="맑은 고딕"/>
               </w:rPr>
@@ -7475,6 +7730,7 @@
             <w:r>
               <w:rPr>
                 <w:b/>
+                <w:i w:val="0"/>
                 <w:sz w:val="18"/>
                 <w:rFonts w:ascii="맑은 고딕" w:hAnsi="맑은 고딕" w:eastAsia="맑은 고딕" w:cs="맑은 고딕"/>
               </w:rPr>
@@ -7494,6 +7750,7 @@
             <w:r>
               <w:rPr>
                 <w:b w:val="0"/>
+                <w:i w:val="0"/>
                 <w:sz w:val="18"/>
                 <w:rFonts w:ascii="맑은 고딕" w:hAnsi="맑은 고딕" w:eastAsia="맑은 고딕" w:cs="맑은 고딕"/>
               </w:rPr>
@@ -7514,6 +7771,7 @@
             <w:r>
               <w:rPr>
                 <w:b/>
+                <w:i w:val="0"/>
                 <w:sz w:val="18"/>
                 <w:rFonts w:ascii="맑은 고딕" w:hAnsi="맑은 고딕" w:eastAsia="맑은 고딕" w:cs="맑은 고딕"/>
               </w:rPr>
@@ -7532,6 +7790,7 @@
             <w:r>
               <w:rPr>
                 <w:b w:val="0"/>
+                <w:i w:val="0"/>
                 <w:sz w:val="18"/>
                 <w:rFonts w:ascii="맑은 고딕" w:hAnsi="맑은 고딕" w:eastAsia="맑은 고딕" w:cs="맑은 고딕"/>
               </w:rPr>
@@ -7667,6 +7926,7 @@
             <w:r>
               <w:rPr>
                 <w:b/>
+                <w:i w:val="0"/>
                 <w:sz w:val="18"/>
                 <w:rFonts w:ascii="맑은 고딕" w:hAnsi="맑은 고딕" w:eastAsia="맑은 고딕" w:cs="맑은 고딕"/>
               </w:rPr>
@@ -7685,6 +7945,7 @@
             <w:r>
               <w:rPr>
                 <w:b/>
+                <w:i w:val="0"/>
                 <w:sz w:val="18"/>
                 <w:rFonts w:ascii="맑은 고딕" w:hAnsi="맑은 고딕" w:eastAsia="맑은 고딕" w:cs="맑은 고딕"/>
               </w:rPr>
@@ -7693,6 +7954,7 @@
             <w:r>
               <w:rPr>
                 <w:b w:val="0"/>
+                <w:i w:val="0"/>
                 <w:sz w:val="18"/>
                 <w:rFonts w:ascii="맑은 고딕" w:hAnsi="맑은 고딕" w:eastAsia="맑은 고딕" w:cs="맑은 고딕"/>
               </w:rPr>
@@ -7711,6 +7973,7 @@
             <w:r>
               <w:rPr>
                 <w:b w:val="0"/>
+                <w:i w:val="0"/>
                 <w:sz w:val="18"/>
                 <w:rFonts w:ascii="맑은 고딕" w:hAnsi="맑은 고딕" w:eastAsia="맑은 고딕" w:cs="맑은 고딕"/>
               </w:rPr>
@@ -7732,6 +7995,7 @@
             <w:r>
               <w:rPr>
                 <w:b/>
+                <w:i w:val="0"/>
                 <w:sz w:val="18"/>
                 <w:rFonts w:ascii="맑은 고딕" w:hAnsi="맑은 고딕" w:eastAsia="맑은 고딕" w:cs="맑은 고딕"/>
               </w:rPr>
@@ -7751,6 +8015,7 @@
             <w:r>
               <w:rPr>
                 <w:b/>
+                <w:i w:val="0"/>
                 <w:sz w:val="18"/>
                 <w:rFonts w:ascii="맑은 고딕" w:hAnsi="맑은 고딕" w:eastAsia="맑은 고딕" w:cs="맑은 고딕"/>
               </w:rPr>
@@ -7759,6 +8024,7 @@
             <w:r>
               <w:rPr>
                 <w:b w:val="0"/>
+                <w:i w:val="0"/>
                 <w:sz w:val="18"/>
                 <w:rFonts w:ascii="맑은 고딕" w:hAnsi="맑은 고딕" w:eastAsia="맑은 고딕" w:cs="맑은 고딕"/>
               </w:rPr>
@@ -7778,6 +8044,7 @@
             <w:r>
               <w:rPr>
                 <w:b w:val="0"/>
+                <w:i w:val="0"/>
                 <w:sz w:val="18"/>
                 <w:rFonts w:ascii="맑은 고딕" w:hAnsi="맑은 고딕" w:eastAsia="맑은 고딕" w:cs="맑은 고딕"/>
               </w:rPr>
@@ -7798,6 +8065,7 @@
             <w:r>
               <w:rPr>
                 <w:b/>
+                <w:i w:val="0"/>
                 <w:sz w:val="18"/>
                 <w:rFonts w:ascii="맑은 고딕" w:hAnsi="맑은 고딕" w:eastAsia="맑은 고딕" w:cs="맑은 고딕"/>
               </w:rPr>
@@ -7816,6 +8084,7 @@
             <w:r>
               <w:rPr>
                 <w:b/>
+                <w:i w:val="0"/>
                 <w:sz w:val="18"/>
                 <w:rFonts w:ascii="맑은 고딕" w:hAnsi="맑은 고딕" w:eastAsia="맑은 고딕" w:cs="맑은 고딕"/>
               </w:rPr>
@@ -7824,6 +8093,7 @@
             <w:r>
               <w:rPr>
                 <w:b w:val="0"/>
+                <w:i w:val="0"/>
                 <w:sz w:val="18"/>
                 <w:rFonts w:ascii="맑은 고딕" w:hAnsi="맑은 고딕" w:eastAsia="맑은 고딕" w:cs="맑은 고딕"/>
               </w:rPr>
@@ -7842,6 +8112,7 @@
             <w:r>
               <w:rPr>
                 <w:b w:val="0"/>
+                <w:i w:val="0"/>
                 <w:sz w:val="18"/>
                 <w:rFonts w:ascii="맑은 고딕" w:hAnsi="맑은 고딕" w:eastAsia="맑은 고딕" w:cs="맑은 고딕"/>
               </w:rPr>
@@ -7863,6 +8134,7 @@
             <w:r>
               <w:rPr>
                 <w:b/>
+                <w:i w:val="0"/>
                 <w:sz w:val="18"/>
                 <w:rFonts w:ascii="맑은 고딕" w:hAnsi="맑은 고딕" w:eastAsia="맑은 고딕" w:cs="맑은 고딕"/>
               </w:rPr>
@@ -7882,6 +8154,7 @@
             <w:r>
               <w:rPr>
                 <w:b/>
+                <w:i w:val="0"/>
                 <w:sz w:val="18"/>
                 <w:rFonts w:ascii="맑은 고딕" w:hAnsi="맑은 고딕" w:eastAsia="맑은 고딕" w:cs="맑은 고딕"/>
               </w:rPr>
@@ -7901,6 +8174,7 @@
             <w:r>
               <w:rPr>
                 <w:b w:val="0"/>
+                <w:i w:val="0"/>
                 <w:sz w:val="18"/>
                 <w:rFonts w:ascii="맑은 고딕" w:hAnsi="맑은 고딕" w:eastAsia="맑은 고딕" w:cs="맑은 고딕"/>
               </w:rPr>
@@ -7921,6 +8195,7 @@
             <w:r>
               <w:rPr>
                 <w:b/>
+                <w:i w:val="0"/>
                 <w:sz w:val="18"/>
                 <w:rFonts w:ascii="맑은 고딕" w:hAnsi="맑은 고딕" w:eastAsia="맑은 고딕" w:cs="맑은 고딕"/>
               </w:rPr>
@@ -7939,6 +8214,7 @@
             <w:r>
               <w:rPr>
                 <w:b w:val="0"/>
+                <w:i w:val="0"/>
                 <w:sz w:val="18"/>
                 <w:rFonts w:ascii="맑은 고딕" w:hAnsi="맑은 고딕" w:eastAsia="맑은 고딕" w:cs="맑은 고딕"/>
               </w:rPr>
@@ -7947,6 +8223,7 @@
             <w:r>
               <w:rPr>
                 <w:b/>
+                <w:i w:val="0"/>
                 <w:sz w:val="18"/>
                 <w:rFonts w:ascii="맑은 고딕" w:hAnsi="맑은 고딕" w:eastAsia="맑은 고딕" w:cs="맑은 고딕"/>
               </w:rPr>
@@ -7955,6 +8232,7 @@
             <w:r>
               <w:rPr>
                 <w:b w:val="0"/>
+                <w:i w:val="0"/>
                 <w:sz w:val="18"/>
                 <w:rFonts w:ascii="맑은 고딕" w:hAnsi="맑은 고딕" w:eastAsia="맑은 고딕" w:cs="맑은 고딕"/>
               </w:rPr>
@@ -7963,6 +8241,7 @@
             <w:r>
               <w:rPr>
                 <w:b/>
+                <w:i w:val="0"/>
                 <w:sz w:val="18"/>
                 <w:rFonts w:ascii="맑은 고딕" w:hAnsi="맑은 고딕" w:eastAsia="맑은 고딕" w:cs="맑은 고딕"/>
               </w:rPr>
@@ -7981,6 +8260,7 @@
             <w:r>
               <w:rPr>
                 <w:b w:val="0"/>
+                <w:i w:val="0"/>
                 <w:sz w:val="18"/>
                 <w:rFonts w:ascii="맑은 고딕" w:hAnsi="맑은 고딕" w:eastAsia="맑은 고딕" w:cs="맑은 고딕"/>
               </w:rPr>
@@ -8034,6 +8314,8 @@
       </w:r>
       <w:r>
         <w:rPr>
+          <w:b w:val="0"/>
+          <w:i w:val="0"/>
           <w:sz w:val="20"/>
           <w:rFonts w:ascii="맑은 고딕" w:hAnsi="맑은 고딕" w:eastAsia="맑은 고딕" w:cs="맑은 고딕"/>
         </w:rPr>
@@ -8056,6 +8338,8 @@
       </w:r>
       <w:r>
         <w:rPr>
+          <w:b w:val="0"/>
+          <w:i w:val="0"/>
           <w:sz w:val="20"/>
           <w:rFonts w:ascii="맑은 고딕" w:hAnsi="맑은 고딕" w:eastAsia="맑은 고딕" w:cs="맑은 고딕"/>
         </w:rPr>
@@ -8078,6 +8362,8 @@
       </w:r>
       <w:r>
         <w:rPr>
+          <w:b w:val="0"/>
+          <w:i w:val="0"/>
           <w:sz w:val="20"/>
           <w:rFonts w:ascii="맑은 고딕" w:hAnsi="맑은 고딕" w:eastAsia="맑은 고딕" w:cs="맑은 고딕"/>
         </w:rPr>
@@ -8242,6 +8528,7 @@
             <w:r>
               <w:rPr>
                 <w:b/>
+                <w:i w:val="0"/>
                 <w:sz w:val="18"/>
                 <w:rFonts w:ascii="맑은 고딕" w:hAnsi="맑은 고딕" w:eastAsia="맑은 고딕" w:cs="맑은 고딕"/>
               </w:rPr>
@@ -8260,6 +8547,7 @@
             <w:r>
               <w:rPr>
                 <w:b w:val="0"/>
+                <w:i w:val="0"/>
                 <w:sz w:val="18"/>
                 <w:rFonts w:ascii="맑은 고딕" w:hAnsi="맑은 고딕" w:eastAsia="맑은 고딕" w:cs="맑은 고딕"/>
               </w:rPr>
@@ -8268,6 +8556,7 @@
             <w:r>
               <w:rPr>
                 <w:b/>
+                <w:i w:val="0"/>
                 <w:sz w:val="18"/>
                 <w:rFonts w:ascii="맑은 고딕" w:hAnsi="맑은 고딕" w:eastAsia="맑은 고딕" w:cs="맑은 고딕"/>
               </w:rPr>
@@ -8276,6 +8565,7 @@
             <w:r>
               <w:rPr>
                 <w:b w:val="0"/>
+                <w:i w:val="0"/>
                 <w:sz w:val="18"/>
                 <w:rFonts w:ascii="맑은 고딕" w:hAnsi="맑은 고딕" w:eastAsia="맑은 고딕" w:cs="맑은 고딕"/>
               </w:rPr>
@@ -8297,6 +8587,7 @@
             <w:r>
               <w:rPr>
                 <w:b/>
+                <w:i w:val="0"/>
                 <w:sz w:val="18"/>
                 <w:rFonts w:ascii="맑은 고딕" w:hAnsi="맑은 고딕" w:eastAsia="맑은 고딕" w:cs="맑은 고딕"/>
               </w:rPr>
@@ -8316,6 +8607,7 @@
             <w:r>
               <w:rPr>
                 <w:b w:val="0"/>
+                <w:i w:val="0"/>
                 <w:sz w:val="18"/>
                 <w:rFonts w:ascii="맑은 고딕" w:hAnsi="맑은 고딕" w:eastAsia="맑은 고딕" w:cs="맑은 고딕"/>
               </w:rPr>
@@ -8324,6 +8616,7 @@
             <w:r>
               <w:rPr>
                 <w:b/>
+                <w:i w:val="0"/>
                 <w:sz w:val="18"/>
                 <w:rFonts w:ascii="맑은 고딕" w:hAnsi="맑은 고딕" w:eastAsia="맑은 고딕" w:cs="맑은 고딕"/>
               </w:rPr>
@@ -8332,6 +8625,7 @@
             <w:r>
               <w:rPr>
                 <w:b w:val="0"/>
+                <w:i w:val="0"/>
                 <w:sz w:val="18"/>
                 <w:rFonts w:ascii="맑은 고딕" w:hAnsi="맑은 고딕" w:eastAsia="맑은 고딕" w:cs="맑은 고딕"/>
               </w:rPr>
@@ -8352,6 +8646,7 @@
             <w:r>
               <w:rPr>
                 <w:b/>
+                <w:i w:val="0"/>
                 <w:sz w:val="18"/>
                 <w:rFonts w:ascii="맑은 고딕" w:hAnsi="맑은 고딕" w:eastAsia="맑은 고딕" w:cs="맑은 고딕"/>
               </w:rPr>
@@ -8370,6 +8665,7 @@
             <w:r>
               <w:rPr>
                 <w:b/>
+                <w:i w:val="0"/>
                 <w:sz w:val="18"/>
                 <w:rFonts w:ascii="맑은 고딕" w:hAnsi="맑은 고딕" w:eastAsia="맑은 고딕" w:cs="맑은 고딕"/>
               </w:rPr>
@@ -8378,6 +8674,7 @@
             <w:r>
               <w:rPr>
                 <w:b w:val="0"/>
+                <w:i w:val="0"/>
                 <w:sz w:val="18"/>
                 <w:rFonts w:ascii="맑은 고딕" w:hAnsi="맑은 고딕" w:eastAsia="맑은 고딕" w:cs="맑은 고딕"/>
               </w:rPr>
@@ -8785,6 +9082,7 @@
             <w:r>
               <w:rPr>
                 <w:b/>
+                <w:i w:val="0"/>
                 <w:sz w:val="18"/>
                 <w:rFonts w:ascii="맑은 고딕" w:hAnsi="맑은 고딕" w:eastAsia="맑은 고딕" w:cs="맑은 고딕"/>
               </w:rPr>
@@ -8803,6 +9101,7 @@
             <w:r>
               <w:rPr>
                 <w:b w:val="0"/>
+                <w:i w:val="0"/>
                 <w:sz w:val="18"/>
                 <w:rFonts w:ascii="맑은 고딕" w:hAnsi="맑은 고딕" w:eastAsia="맑은 고딕" w:cs="맑은 고딕"/>
               </w:rPr>
@@ -8824,6 +9123,7 @@
             <w:r>
               <w:rPr>
                 <w:b/>
+                <w:i w:val="0"/>
                 <w:sz w:val="18"/>
                 <w:rFonts w:ascii="맑은 고딕" w:hAnsi="맑은 고딕" w:eastAsia="맑은 고딕" w:cs="맑은 고딕"/>
               </w:rPr>
@@ -8843,6 +9143,7 @@
             <w:r>
               <w:rPr>
                 <w:b w:val="0"/>
+                <w:i w:val="0"/>
                 <w:sz w:val="18"/>
                 <w:rFonts w:ascii="맑은 고딕" w:hAnsi="맑은 고딕" w:eastAsia="맑은 고딕" w:cs="맑은 고딕"/>
               </w:rPr>
@@ -8863,6 +9164,7 @@
             <w:r>
               <w:rPr>
                 <w:b/>
+                <w:i w:val="0"/>
                 <w:sz w:val="18"/>
                 <w:rFonts w:ascii="맑은 고딕" w:hAnsi="맑은 고딕" w:eastAsia="맑은 고딕" w:cs="맑은 고딕"/>
               </w:rPr>
@@ -8881,6 +9183,7 @@
             <w:r>
               <w:rPr>
                 <w:b w:val="0"/>
+                <w:i w:val="0"/>
                 <w:sz w:val="18"/>
                 <w:rFonts w:ascii="맑은 고딕" w:hAnsi="맑은 고딕" w:eastAsia="맑은 고딕" w:cs="맑은 고딕"/>
               </w:rPr>
@@ -8902,6 +9205,7 @@
             <w:r>
               <w:rPr>
                 <w:b/>
+                <w:i w:val="0"/>
                 <w:sz w:val="18"/>
                 <w:rFonts w:ascii="맑은 고딕" w:hAnsi="맑은 고딕" w:eastAsia="맑은 고딕" w:cs="맑은 고딕"/>
               </w:rPr>
@@ -8921,6 +9225,7 @@
             <w:r>
               <w:rPr>
                 <w:b w:val="0"/>
+                <w:i w:val="0"/>
                 <w:sz w:val="18"/>
                 <w:rFonts w:ascii="맑은 고딕" w:hAnsi="맑은 고딕" w:eastAsia="맑은 고딕" w:cs="맑은 고딕"/>
               </w:rPr>

</xml_diff>